<commit_message>
Add academic statistics (95% CI, p, OR) to N=400 reports and admin panel.
Co-authored-by: Cursor <cursoragent@cursor.com>
</commit_message>
<xml_diff>
--- a/public/reports/n400/Anketa_Tahlili_N400.docx
+++ b/public/reports/n400/Anketa_Tahlili_N400.docx
@@ -8,7 +8,7 @@
         <w:jc w:val="center"/>
       </w:pPr>
       <w:r>
-        <w:t>ANKETA TAHLILI — EnergoHealth-Predict</w:t>
+        <w:t>ANKETA TAHLILI — Noinfeksion kardiologik xavflarni prognozlash va monitoring qilish milliy-ilmiy ko'p rolli portali</w:t>
       </w:r>
     </w:p>
     <w:p>
@@ -16,12 +16,12 @@
         <w:jc w:val="center"/>
       </w:pPr>
       <w:r>
-        <w:t>Farg'ona Issiqlik Elektr Stansiyasi xodimlari so'rovnomasi tahlili | Jami anketa: N=698 | Tahlil guruhi: n=400 | 09.09.2026</w:t>
+        <w:t>Farg'ona Issiqlik Elektr Stansiyasi xodimlari so'rovnomasi tahlili | Jami anketa: N=698 | Tahlil guruhi: n=400 | 18.09.2026</w:t>
       </w:r>
     </w:p>
     <w:p>
       <w:r>
-        <w:t>Mazkur hisobot kasalliklar tasnifi emas, balki 75 savollik anketa bo'limlari bo'yicha javoblar statistikasi va EnergoHealth-Predict tizimi orqali erta kasallanish xavfini baholash natijalarini aks ettiradi.</w:t>
+        <w:t>Mazkur hisobot kasalliklar tasnifi emas, balki 75 savollik anketa bo'limlari bo'yicha javoblar statistikasi va Noinfeksion kardiologik xavflarni prognozlash va monitoring qilish milliy-ilmiy ko'p rolli portali tizimi orqali erta kasallanish xavfini baholash natijalarini aks ettiradi.</w:t>
       </w:r>
     </w:p>
     <w:p>
@@ -29,12 +29,12 @@
         <w:pStyle w:val="Heading1"/>
       </w:pPr>
       <w:r>
-        <w:t>Xavf prognozi — yashil / sariq / qizil (EnergoHealth-Predict)</w:t>
+        <w:t>Xavf prognozi — yashil / sariq / qizil (Noinfeksion kardiologik xavflarni prognozlash va monitoring qilish milliy-ilmiy ko'p rolli portali)</w:t>
       </w:r>
     </w:p>
     <w:p>
       <w:r>
-        <w:t>EnergoHealth-Predict tizimi 75 savollik anketa asosida har bir xodim uchun kasallanish xavfini erta baholaydi. 400 nafar namunada o'rtacha xavf balli 57.4%. Yashil zona (past xavf): 35 nafar (8.8%) — kelajakda kasallanish ehtimoli past. Sariq zona (o'rtacha): 334 nafar (83.5%) — profilaktik nazorat talab etiladi. Qizil zona (yuqori): 31 nafar (7.8%) — tezkor tibbiy ko'rik va intervensiya zarur. Tizim klinik tashxis o'rnini bosmaydi, faqat xavfni erta aniqlash uchun mo'ljallangan.</w:t>
+        <w:t>Noinfeksion kardiologik xavflarni prognozlash va monitoring qilish milliy-ilmiy ko'p rolli portali tizimi 75 savollik anketa asosida har bir xodim uchun kasallanish xavfini erta baholaydi. 400 nafar namunada o'rtacha xavf balli 57.4%. Yashil zona (past xavf): 35 nafar (8.8%) — kelajakda kasallanish ehtimoli past. Sariq zona (o'rtacha): 334 nafar (83.5%) — profilaktik nazorat talab etiladi. Qizil zona (yuqori): 31 nafar (7.8%) — tezkor tibbiy ko'rik va intervensiya zarur. Tizim klinik tashxis o'rnini bosmaydi, faqat xavfni erta aniqlash uchun mo'ljallangan.</w:t>
       </w:r>
     </w:p>
     <w:tbl>
@@ -44,15 +44,16 @@
         <w:tblLook w:firstColumn="1" w:firstRow="1" w:lastColumn="0" w:lastRow="0" w:noHBand="0" w:noVBand="1" w:val="04A0"/>
       </w:tblPr>
       <w:tblGrid>
-        <w:gridCol w:w="2160"/>
-        <w:gridCol w:w="2160"/>
-        <w:gridCol w:w="2160"/>
-        <w:gridCol w:w="2160"/>
+        <w:gridCol w:w="1728"/>
+        <w:gridCol w:w="1728"/>
+        <w:gridCol w:w="1728"/>
+        <w:gridCol w:w="1728"/>
+        <w:gridCol w:w="1728"/>
       </w:tblGrid>
       <w:tr>
         <w:tc>
           <w:tcPr>
-            <w:tcW w:type="dxa" w:w="2160"/>
+            <w:tcW w:type="dxa" w:w="1728"/>
           </w:tcPr>
           <w:p>
             <w:r>
@@ -62,7 +63,7 @@
         </w:tc>
         <w:tc>
           <w:tcPr>
-            <w:tcW w:type="dxa" w:w="2160"/>
+            <w:tcW w:type="dxa" w:w="1728"/>
           </w:tcPr>
           <w:p>
             <w:r>
@@ -72,7 +73,7 @@
         </w:tc>
         <w:tc>
           <w:tcPr>
-            <w:tcW w:type="dxa" w:w="2160"/>
+            <w:tcW w:type="dxa" w:w="1728"/>
           </w:tcPr>
           <w:p>
             <w:r>
@@ -82,11 +83,21 @@
         </w:tc>
         <w:tc>
           <w:tcPr>
-            <w:tcW w:type="dxa" w:w="2160"/>
+            <w:tcW w:type="dxa" w:w="1728"/>
           </w:tcPr>
           <w:p>
             <w:r>
               <w:t>%</w:t>
+            </w:r>
+          </w:p>
+        </w:tc>
+        <w:tc>
+          <w:tcPr>
+            <w:tcW w:type="dxa" w:w="1728"/>
+          </w:tcPr>
+          <w:p>
+            <w:r>
+              <w:t>95% CI</w:t>
             </w:r>
           </w:p>
         </w:tc>
@@ -94,7 +105,7 @@
       <w:tr>
         <w:tc>
           <w:tcPr>
-            <w:tcW w:type="dxa" w:w="2160"/>
+            <w:tcW w:type="dxa" w:w="1728"/>
           </w:tcPr>
           <w:p>
             <w:r>
@@ -104,7 +115,7 @@
         </w:tc>
         <w:tc>
           <w:tcPr>
-            <w:tcW w:type="dxa" w:w="2160"/>
+            <w:tcW w:type="dxa" w:w="1728"/>
           </w:tcPr>
           <w:p>
             <w:r>
@@ -114,7 +125,7 @@
         </w:tc>
         <w:tc>
           <w:tcPr>
-            <w:tcW w:type="dxa" w:w="2160"/>
+            <w:tcW w:type="dxa" w:w="1728"/>
           </w:tcPr>
           <w:p>
             <w:r>
@@ -124,11 +135,21 @@
         </w:tc>
         <w:tc>
           <w:tcPr>
-            <w:tcW w:type="dxa" w:w="2160"/>
+            <w:tcW w:type="dxa" w:w="1728"/>
           </w:tcPr>
           <w:p>
             <w:r>
               <w:t>8.8%</w:t>
+            </w:r>
+          </w:p>
+        </w:tc>
+        <w:tc>
+          <w:tcPr>
+            <w:tcW w:type="dxa" w:w="1728"/>
+          </w:tcPr>
+          <w:p>
+            <w:r>
+              <w:t>6.0–11.5</w:t>
             </w:r>
           </w:p>
         </w:tc>
@@ -136,7 +157,7 @@
       <w:tr>
         <w:tc>
           <w:tcPr>
-            <w:tcW w:type="dxa" w:w="2160"/>
+            <w:tcW w:type="dxa" w:w="1728"/>
           </w:tcPr>
           <w:p>
             <w:r>
@@ -146,7 +167,7 @@
         </w:tc>
         <w:tc>
           <w:tcPr>
-            <w:tcW w:type="dxa" w:w="2160"/>
+            <w:tcW w:type="dxa" w:w="1728"/>
           </w:tcPr>
           <w:p>
             <w:r>
@@ -156,7 +177,7 @@
         </w:tc>
         <w:tc>
           <w:tcPr>
-            <w:tcW w:type="dxa" w:w="2160"/>
+            <w:tcW w:type="dxa" w:w="1728"/>
           </w:tcPr>
           <w:p>
             <w:r>
@@ -166,11 +187,21 @@
         </w:tc>
         <w:tc>
           <w:tcPr>
-            <w:tcW w:type="dxa" w:w="2160"/>
+            <w:tcW w:type="dxa" w:w="1728"/>
           </w:tcPr>
           <w:p>
             <w:r>
               <w:t>83.5%</w:t>
+            </w:r>
+          </w:p>
+        </w:tc>
+        <w:tc>
+          <w:tcPr>
+            <w:tcW w:type="dxa" w:w="1728"/>
+          </w:tcPr>
+          <w:p>
+            <w:r>
+              <w:t>79.9–87.1</w:t>
             </w:r>
           </w:p>
         </w:tc>
@@ -178,7 +209,7 @@
       <w:tr>
         <w:tc>
           <w:tcPr>
-            <w:tcW w:type="dxa" w:w="2160"/>
+            <w:tcW w:type="dxa" w:w="1728"/>
           </w:tcPr>
           <w:p>
             <w:r>
@@ -188,7 +219,7 @@
         </w:tc>
         <w:tc>
           <w:tcPr>
-            <w:tcW w:type="dxa" w:w="2160"/>
+            <w:tcW w:type="dxa" w:w="1728"/>
           </w:tcPr>
           <w:p>
             <w:r>
@@ -198,7 +229,7 @@
         </w:tc>
         <w:tc>
           <w:tcPr>
-            <w:tcW w:type="dxa" w:w="2160"/>
+            <w:tcW w:type="dxa" w:w="1728"/>
           </w:tcPr>
           <w:p>
             <w:r>
@@ -208,11 +239,21 @@
         </w:tc>
         <w:tc>
           <w:tcPr>
-            <w:tcW w:type="dxa" w:w="2160"/>
+            <w:tcW w:type="dxa" w:w="1728"/>
           </w:tcPr>
           <w:p>
             <w:r>
               <w:t>7.8%</w:t>
+            </w:r>
+          </w:p>
+        </w:tc>
+        <w:tc>
+          <w:tcPr>
+            <w:tcW w:type="dxa" w:w="1728"/>
+          </w:tcPr>
+          <w:p>
+            <w:r>
+              <w:t>5.1–10.4</w:t>
             </w:r>
           </w:p>
         </w:tc>
@@ -223,7 +264,7 @@
       <w:r>
         <w:drawing>
           <wp:inline xmlns:a="http://schemas.openxmlformats.org/drawingml/2006/main" xmlns:pic="http://schemas.openxmlformats.org/drawingml/2006/picture">
-            <wp:extent cx="5029200" cy="5052376"/>
+            <wp:extent cx="5029200" cy="2221612"/>
             <wp:docPr id="1" name="Picture 1"/>
             <wp:cNvGraphicFramePr>
               <a:graphicFrameLocks noChangeAspect="1"/>
@@ -244,7 +285,7 @@
                   <pic:spPr>
                     <a:xfrm>
                       <a:off x="0" y="0"/>
-                      <a:ext cx="5029200" cy="5052376"/>
+                      <a:ext cx="5029200" cy="2221612"/>
                     </a:xfrm>
                     <a:prstGeom prst="rect"/>
                   </pic:spPr>
@@ -280,15 +321,16 @@
         <w:tblLook w:firstColumn="1" w:firstRow="1" w:lastColumn="0" w:lastRow="0" w:noHBand="0" w:noVBand="1" w:val="04A0"/>
       </w:tblPr>
       <w:tblGrid>
-        <w:gridCol w:w="2160"/>
-        <w:gridCol w:w="2160"/>
-        <w:gridCol w:w="2160"/>
-        <w:gridCol w:w="2160"/>
+        <w:gridCol w:w="1728"/>
+        <w:gridCol w:w="1728"/>
+        <w:gridCol w:w="1728"/>
+        <w:gridCol w:w="1728"/>
+        <w:gridCol w:w="1728"/>
       </w:tblGrid>
       <w:tr>
         <w:tc>
           <w:tcPr>
-            <w:tcW w:type="dxa" w:w="2160"/>
+            <w:tcW w:type="dxa" w:w="1728"/>
           </w:tcPr>
           <w:p>
             <w:r>
@@ -298,7 +340,7 @@
         </w:tc>
         <w:tc>
           <w:tcPr>
-            <w:tcW w:type="dxa" w:w="2160"/>
+            <w:tcW w:type="dxa" w:w="1728"/>
           </w:tcPr>
           <w:p>
             <w:r>
@@ -308,7 +350,7 @@
         </w:tc>
         <w:tc>
           <w:tcPr>
-            <w:tcW w:type="dxa" w:w="2160"/>
+            <w:tcW w:type="dxa" w:w="1728"/>
           </w:tcPr>
           <w:p>
             <w:r>
@@ -318,11 +360,21 @@
         </w:tc>
         <w:tc>
           <w:tcPr>
-            <w:tcW w:type="dxa" w:w="2160"/>
+            <w:tcW w:type="dxa" w:w="1728"/>
           </w:tcPr>
           <w:p>
             <w:r>
               <w:t>%</w:t>
+            </w:r>
+          </w:p>
+        </w:tc>
+        <w:tc>
+          <w:tcPr>
+            <w:tcW w:type="dxa" w:w="1728"/>
+          </w:tcPr>
+          <w:p>
+            <w:r>
+              <w:t>95% CI</w:t>
             </w:r>
           </w:p>
         </w:tc>
@@ -330,7 +382,7 @@
       <w:tr>
         <w:tc>
           <w:tcPr>
-            <w:tcW w:type="dxa" w:w="2160"/>
+            <w:tcW w:type="dxa" w:w="1728"/>
           </w:tcPr>
           <w:p>
             <w:r>
@@ -340,7 +392,7 @@
         </w:tc>
         <w:tc>
           <w:tcPr>
-            <w:tcW w:type="dxa" w:w="2160"/>
+            <w:tcW w:type="dxa" w:w="1728"/>
           </w:tcPr>
           <w:p>
             <w:r>
@@ -350,7 +402,7 @@
         </w:tc>
         <w:tc>
           <w:tcPr>
-            <w:tcW w:type="dxa" w:w="2160"/>
+            <w:tcW w:type="dxa" w:w="1728"/>
           </w:tcPr>
           <w:p>
             <w:r>
@@ -360,11 +412,21 @@
         </w:tc>
         <w:tc>
           <w:tcPr>
-            <w:tcW w:type="dxa" w:w="2160"/>
+            <w:tcW w:type="dxa" w:w="1728"/>
           </w:tcPr>
           <w:p>
             <w:r>
               <w:t>82.0%</w:t>
+            </w:r>
+          </w:p>
+        </w:tc>
+        <w:tc>
+          <w:tcPr>
+            <w:tcW w:type="dxa" w:w="1728"/>
+          </w:tcPr>
+          <w:p>
+            <w:r>
+              <w:t>78.2–85.8</w:t>
             </w:r>
           </w:p>
         </w:tc>
@@ -372,7 +434,7 @@
       <w:tr>
         <w:tc>
           <w:tcPr>
-            <w:tcW w:type="dxa" w:w="2160"/>
+            <w:tcW w:type="dxa" w:w="1728"/>
           </w:tcPr>
           <w:p>
             <w:r>
@@ -382,7 +444,7 @@
         </w:tc>
         <w:tc>
           <w:tcPr>
-            <w:tcW w:type="dxa" w:w="2160"/>
+            <w:tcW w:type="dxa" w:w="1728"/>
           </w:tcPr>
           <w:p>
             <w:r>
@@ -392,7 +454,7 @@
         </w:tc>
         <w:tc>
           <w:tcPr>
-            <w:tcW w:type="dxa" w:w="2160"/>
+            <w:tcW w:type="dxa" w:w="1728"/>
           </w:tcPr>
           <w:p>
             <w:r>
@@ -402,11 +464,21 @@
         </w:tc>
         <w:tc>
           <w:tcPr>
-            <w:tcW w:type="dxa" w:w="2160"/>
+            <w:tcW w:type="dxa" w:w="1728"/>
           </w:tcPr>
           <w:p>
             <w:r>
               <w:t>18.0%</w:t>
+            </w:r>
+          </w:p>
+        </w:tc>
+        <w:tc>
+          <w:tcPr>
+            <w:tcW w:type="dxa" w:w="1728"/>
+          </w:tcPr>
+          <w:p>
+            <w:r>
+              <w:t>14.2–21.8</w:t>
             </w:r>
           </w:p>
         </w:tc>
@@ -414,7 +486,7 @@
       <w:tr>
         <w:tc>
           <w:tcPr>
-            <w:tcW w:type="dxa" w:w="2160"/>
+            <w:tcW w:type="dxa" w:w="1728"/>
           </w:tcPr>
           <w:p>
             <w:r>
@@ -424,7 +496,7 @@
         </w:tc>
         <w:tc>
           <w:tcPr>
-            <w:tcW w:type="dxa" w:w="2160"/>
+            <w:tcW w:type="dxa" w:w="1728"/>
           </w:tcPr>
           <w:p>
             <w:r>
@@ -434,7 +506,7 @@
         </w:tc>
         <w:tc>
           <w:tcPr>
-            <w:tcW w:type="dxa" w:w="2160"/>
+            <w:tcW w:type="dxa" w:w="1728"/>
           </w:tcPr>
           <w:p>
             <w:r>
@@ -444,11 +516,21 @@
         </w:tc>
         <w:tc>
           <w:tcPr>
-            <w:tcW w:type="dxa" w:w="2160"/>
+            <w:tcW w:type="dxa" w:w="1728"/>
           </w:tcPr>
           <w:p>
             <w:r>
               <w:t>78.0%</w:t>
+            </w:r>
+          </w:p>
+        </w:tc>
+        <w:tc>
+          <w:tcPr>
+            <w:tcW w:type="dxa" w:w="1728"/>
+          </w:tcPr>
+          <w:p>
+            <w:r>
+              <w:t>73.9–82.1</w:t>
             </w:r>
           </w:p>
         </w:tc>
@@ -456,7 +538,7 @@
       <w:tr>
         <w:tc>
           <w:tcPr>
-            <w:tcW w:type="dxa" w:w="2160"/>
+            <w:tcW w:type="dxa" w:w="1728"/>
           </w:tcPr>
           <w:p>
             <w:r>
@@ -466,7 +548,7 @@
         </w:tc>
         <w:tc>
           <w:tcPr>
-            <w:tcW w:type="dxa" w:w="2160"/>
+            <w:tcW w:type="dxa" w:w="1728"/>
           </w:tcPr>
           <w:p>
             <w:r>
@@ -476,7 +558,7 @@
         </w:tc>
         <w:tc>
           <w:tcPr>
-            <w:tcW w:type="dxa" w:w="2160"/>
+            <w:tcW w:type="dxa" w:w="1728"/>
           </w:tcPr>
           <w:p>
             <w:r>
@@ -486,11 +568,21 @@
         </w:tc>
         <w:tc>
           <w:tcPr>
-            <w:tcW w:type="dxa" w:w="2160"/>
+            <w:tcW w:type="dxa" w:w="1728"/>
           </w:tcPr>
           <w:p>
             <w:r>
               <w:t>14.0%</w:t>
+            </w:r>
+          </w:p>
+        </w:tc>
+        <w:tc>
+          <w:tcPr>
+            <w:tcW w:type="dxa" w:w="1728"/>
+          </w:tcPr>
+          <w:p>
+            <w:r>
+              <w:t>10.6–17.4</w:t>
             </w:r>
           </w:p>
         </w:tc>
@@ -498,7 +590,7 @@
       <w:tr>
         <w:tc>
           <w:tcPr>
-            <w:tcW w:type="dxa" w:w="2160"/>
+            <w:tcW w:type="dxa" w:w="1728"/>
           </w:tcPr>
           <w:p>
             <w:r>
@@ -508,7 +600,7 @@
         </w:tc>
         <w:tc>
           <w:tcPr>
-            <w:tcW w:type="dxa" w:w="2160"/>
+            <w:tcW w:type="dxa" w:w="1728"/>
           </w:tcPr>
           <w:p>
             <w:r>
@@ -518,7 +610,7 @@
         </w:tc>
         <w:tc>
           <w:tcPr>
-            <w:tcW w:type="dxa" w:w="2160"/>
+            <w:tcW w:type="dxa" w:w="1728"/>
           </w:tcPr>
           <w:p>
             <w:r>
@@ -528,11 +620,21 @@
         </w:tc>
         <w:tc>
           <w:tcPr>
-            <w:tcW w:type="dxa" w:w="2160"/>
+            <w:tcW w:type="dxa" w:w="1728"/>
           </w:tcPr>
           <w:p>
             <w:r>
               <w:t>12.0%</w:t>
+            </w:r>
+          </w:p>
+        </w:tc>
+        <w:tc>
+          <w:tcPr>
+            <w:tcW w:type="dxa" w:w="1728"/>
+          </w:tcPr>
+          <w:p>
+            <w:r>
+              <w:t>8.8–15.2</w:t>
             </w:r>
           </w:p>
         </w:tc>
@@ -540,7 +642,7 @@
       <w:tr>
         <w:tc>
           <w:tcPr>
-            <w:tcW w:type="dxa" w:w="2160"/>
+            <w:tcW w:type="dxa" w:w="1728"/>
           </w:tcPr>
           <w:p>
             <w:r>
@@ -550,7 +652,7 @@
         </w:tc>
         <w:tc>
           <w:tcPr>
-            <w:tcW w:type="dxa" w:w="2160"/>
+            <w:tcW w:type="dxa" w:w="1728"/>
           </w:tcPr>
           <w:p>
             <w:r>
@@ -560,7 +662,7 @@
         </w:tc>
         <w:tc>
           <w:tcPr>
-            <w:tcW w:type="dxa" w:w="2160"/>
+            <w:tcW w:type="dxa" w:w="1728"/>
           </w:tcPr>
           <w:p>
             <w:r>
@@ -570,11 +672,21 @@
         </w:tc>
         <w:tc>
           <w:tcPr>
-            <w:tcW w:type="dxa" w:w="2160"/>
+            <w:tcW w:type="dxa" w:w="1728"/>
           </w:tcPr>
           <w:p>
             <w:r>
               <w:t>88.0%</w:t>
+            </w:r>
+          </w:p>
+        </w:tc>
+        <w:tc>
+          <w:tcPr>
+            <w:tcW w:type="dxa" w:w="1728"/>
+          </w:tcPr>
+          <w:p>
+            <w:r>
+              <w:t>84.8–91.2</w:t>
             </w:r>
           </w:p>
         </w:tc>
@@ -582,7 +694,7 @@
       <w:tr>
         <w:tc>
           <w:tcPr>
-            <w:tcW w:type="dxa" w:w="2160"/>
+            <w:tcW w:type="dxa" w:w="1728"/>
           </w:tcPr>
           <w:p>
             <w:r>
@@ -592,7 +704,7 @@
         </w:tc>
         <w:tc>
           <w:tcPr>
-            <w:tcW w:type="dxa" w:w="2160"/>
+            <w:tcW w:type="dxa" w:w="1728"/>
           </w:tcPr>
           <w:p>
             <w:r>
@@ -602,7 +714,7 @@
         </w:tc>
         <w:tc>
           <w:tcPr>
-            <w:tcW w:type="dxa" w:w="2160"/>
+            <w:tcW w:type="dxa" w:w="1728"/>
           </w:tcPr>
           <w:p>
             <w:r>
@@ -612,11 +724,21 @@
         </w:tc>
         <w:tc>
           <w:tcPr>
-            <w:tcW w:type="dxa" w:w="2160"/>
+            <w:tcW w:type="dxa" w:w="1728"/>
           </w:tcPr>
           <w:p>
             <w:r>
               <w:t>22.0%</w:t>
+            </w:r>
+          </w:p>
+        </w:tc>
+        <w:tc>
+          <w:tcPr>
+            <w:tcW w:type="dxa" w:w="1728"/>
+          </w:tcPr>
+          <w:p>
+            <w:r>
+              <w:t>17.9–26.1</w:t>
             </w:r>
           </w:p>
         </w:tc>
@@ -624,7 +746,7 @@
       <w:tr>
         <w:tc>
           <w:tcPr>
-            <w:tcW w:type="dxa" w:w="2160"/>
+            <w:tcW w:type="dxa" w:w="1728"/>
           </w:tcPr>
           <w:p>
             <w:r>
@@ -634,7 +756,7 @@
         </w:tc>
         <w:tc>
           <w:tcPr>
-            <w:tcW w:type="dxa" w:w="2160"/>
+            <w:tcW w:type="dxa" w:w="1728"/>
           </w:tcPr>
           <w:p>
             <w:r>
@@ -644,7 +766,7 @@
         </w:tc>
         <w:tc>
           <w:tcPr>
-            <w:tcW w:type="dxa" w:w="2160"/>
+            <w:tcW w:type="dxa" w:w="1728"/>
           </w:tcPr>
           <w:p>
             <w:r>
@@ -654,11 +776,21 @@
         </w:tc>
         <w:tc>
           <w:tcPr>
-            <w:tcW w:type="dxa" w:w="2160"/>
+            <w:tcW w:type="dxa" w:w="1728"/>
           </w:tcPr>
           <w:p>
             <w:r>
               <w:t>18.0%</w:t>
+            </w:r>
+          </w:p>
+        </w:tc>
+        <w:tc>
+          <w:tcPr>
+            <w:tcW w:type="dxa" w:w="1728"/>
+          </w:tcPr>
+          <w:p>
+            <w:r>
+              <w:t>14.2–21.8</w:t>
             </w:r>
           </w:p>
         </w:tc>
@@ -666,7 +798,7 @@
       <w:tr>
         <w:tc>
           <w:tcPr>
-            <w:tcW w:type="dxa" w:w="2160"/>
+            <w:tcW w:type="dxa" w:w="1728"/>
           </w:tcPr>
           <w:p>
             <w:r>
@@ -676,7 +808,7 @@
         </w:tc>
         <w:tc>
           <w:tcPr>
-            <w:tcW w:type="dxa" w:w="2160"/>
+            <w:tcW w:type="dxa" w:w="1728"/>
           </w:tcPr>
           <w:p>
             <w:r>
@@ -686,7 +818,7 @@
         </w:tc>
         <w:tc>
           <w:tcPr>
-            <w:tcW w:type="dxa" w:w="2160"/>
+            <w:tcW w:type="dxa" w:w="1728"/>
           </w:tcPr>
           <w:p>
             <w:r>
@@ -696,11 +828,21 @@
         </w:tc>
         <w:tc>
           <w:tcPr>
-            <w:tcW w:type="dxa" w:w="2160"/>
+            <w:tcW w:type="dxa" w:w="1728"/>
           </w:tcPr>
           <w:p>
             <w:r>
               <w:t>28.0%</w:t>
+            </w:r>
+          </w:p>
+        </w:tc>
+        <w:tc>
+          <w:tcPr>
+            <w:tcW w:type="dxa" w:w="1728"/>
+          </w:tcPr>
+          <w:p>
+            <w:r>
+              <w:t>23.6–32.4</w:t>
             </w:r>
           </w:p>
         </w:tc>
@@ -708,7 +850,7 @@
       <w:tr>
         <w:tc>
           <w:tcPr>
-            <w:tcW w:type="dxa" w:w="2160"/>
+            <w:tcW w:type="dxa" w:w="1728"/>
           </w:tcPr>
           <w:p>
             <w:r>
@@ -718,7 +860,7 @@
         </w:tc>
         <w:tc>
           <w:tcPr>
-            <w:tcW w:type="dxa" w:w="2160"/>
+            <w:tcW w:type="dxa" w:w="1728"/>
           </w:tcPr>
           <w:p>
             <w:r>
@@ -728,7 +870,7 @@
         </w:tc>
         <w:tc>
           <w:tcPr>
-            <w:tcW w:type="dxa" w:w="2160"/>
+            <w:tcW w:type="dxa" w:w="1728"/>
           </w:tcPr>
           <w:p>
             <w:r>
@@ -738,11 +880,21 @@
         </w:tc>
         <w:tc>
           <w:tcPr>
-            <w:tcW w:type="dxa" w:w="2160"/>
+            <w:tcW w:type="dxa" w:w="1728"/>
           </w:tcPr>
           <w:p>
             <w:r>
               <w:t>20.0%</w:t>
+            </w:r>
+          </w:p>
+        </w:tc>
+        <w:tc>
+          <w:tcPr>
+            <w:tcW w:type="dxa" w:w="1728"/>
+          </w:tcPr>
+          <w:p>
+            <w:r>
+              <w:t>16.1–23.9</w:t>
             </w:r>
           </w:p>
         </w:tc>
@@ -750,7 +902,7 @@
       <w:tr>
         <w:tc>
           <w:tcPr>
-            <w:tcW w:type="dxa" w:w="2160"/>
+            <w:tcW w:type="dxa" w:w="1728"/>
           </w:tcPr>
           <w:p>
             <w:r>
@@ -760,7 +912,7 @@
         </w:tc>
         <w:tc>
           <w:tcPr>
-            <w:tcW w:type="dxa" w:w="2160"/>
+            <w:tcW w:type="dxa" w:w="1728"/>
           </w:tcPr>
           <w:p>
             <w:r>
@@ -770,7 +922,7 @@
         </w:tc>
         <w:tc>
           <w:tcPr>
-            <w:tcW w:type="dxa" w:w="2160"/>
+            <w:tcW w:type="dxa" w:w="1728"/>
           </w:tcPr>
           <w:p>
             <w:r>
@@ -780,11 +932,21 @@
         </w:tc>
         <w:tc>
           <w:tcPr>
-            <w:tcW w:type="dxa" w:w="2160"/>
+            <w:tcW w:type="dxa" w:w="1728"/>
           </w:tcPr>
           <w:p>
             <w:r>
               <w:t>30.0%</w:t>
+            </w:r>
+          </w:p>
+        </w:tc>
+        <w:tc>
+          <w:tcPr>
+            <w:tcW w:type="dxa" w:w="1728"/>
+          </w:tcPr>
+          <w:p>
+            <w:r>
+              <w:t>25.5–34.5</w:t>
             </w:r>
           </w:p>
         </w:tc>
@@ -792,7 +954,7 @@
       <w:tr>
         <w:tc>
           <w:tcPr>
-            <w:tcW w:type="dxa" w:w="2160"/>
+            <w:tcW w:type="dxa" w:w="1728"/>
           </w:tcPr>
           <w:p>
             <w:r>
@@ -802,7 +964,7 @@
         </w:tc>
         <w:tc>
           <w:tcPr>
-            <w:tcW w:type="dxa" w:w="2160"/>
+            <w:tcW w:type="dxa" w:w="1728"/>
           </w:tcPr>
           <w:p>
             <w:r>
@@ -812,7 +974,7 @@
         </w:tc>
         <w:tc>
           <w:tcPr>
-            <w:tcW w:type="dxa" w:w="2160"/>
+            <w:tcW w:type="dxa" w:w="1728"/>
           </w:tcPr>
           <w:p>
             <w:r>
@@ -822,11 +984,21 @@
         </w:tc>
         <w:tc>
           <w:tcPr>
-            <w:tcW w:type="dxa" w:w="2160"/>
+            <w:tcW w:type="dxa" w:w="1728"/>
           </w:tcPr>
           <w:p>
             <w:r>
               <w:t>50.0%</w:t>
+            </w:r>
+          </w:p>
+        </w:tc>
+        <w:tc>
+          <w:tcPr>
+            <w:tcW w:type="dxa" w:w="1728"/>
+          </w:tcPr>
+          <w:p>
+            <w:r>
+              <w:t>45.1–54.9</w:t>
             </w:r>
           </w:p>
         </w:tc>
@@ -834,7 +1006,7 @@
       <w:tr>
         <w:tc>
           <w:tcPr>
-            <w:tcW w:type="dxa" w:w="2160"/>
+            <w:tcW w:type="dxa" w:w="1728"/>
           </w:tcPr>
           <w:p>
             <w:r>
@@ -844,7 +1016,7 @@
         </w:tc>
         <w:tc>
           <w:tcPr>
-            <w:tcW w:type="dxa" w:w="2160"/>
+            <w:tcW w:type="dxa" w:w="1728"/>
           </w:tcPr>
           <w:p>
             <w:r>
@@ -854,7 +1026,7 @@
         </w:tc>
         <w:tc>
           <w:tcPr>
-            <w:tcW w:type="dxa" w:w="2160"/>
+            <w:tcW w:type="dxa" w:w="1728"/>
           </w:tcPr>
           <w:p>
             <w:r>
@@ -864,11 +1036,21 @@
         </w:tc>
         <w:tc>
           <w:tcPr>
-            <w:tcW w:type="dxa" w:w="2160"/>
+            <w:tcW w:type="dxa" w:w="1728"/>
           </w:tcPr>
           <w:p>
             <w:r>
               <w:t>71.0%</w:t>
+            </w:r>
+          </w:p>
+        </w:tc>
+        <w:tc>
+          <w:tcPr>
+            <w:tcW w:type="dxa" w:w="1728"/>
+          </w:tcPr>
+          <w:p>
+            <w:r>
+              <w:t>66.6–75.4</w:t>
             </w:r>
           </w:p>
         </w:tc>
@@ -876,7 +1058,7 @@
       <w:tr>
         <w:tc>
           <w:tcPr>
-            <w:tcW w:type="dxa" w:w="2160"/>
+            <w:tcW w:type="dxa" w:w="1728"/>
           </w:tcPr>
           <w:p>
             <w:r>
@@ -886,7 +1068,7 @@
         </w:tc>
         <w:tc>
           <w:tcPr>
-            <w:tcW w:type="dxa" w:w="2160"/>
+            <w:tcW w:type="dxa" w:w="1728"/>
           </w:tcPr>
           <w:p>
             <w:r>
@@ -896,7 +1078,7 @@
         </w:tc>
         <w:tc>
           <w:tcPr>
-            <w:tcW w:type="dxa" w:w="2160"/>
+            <w:tcW w:type="dxa" w:w="1728"/>
           </w:tcPr>
           <w:p>
             <w:r>
@@ -906,11 +1088,21 @@
         </w:tc>
         <w:tc>
           <w:tcPr>
-            <w:tcW w:type="dxa" w:w="2160"/>
+            <w:tcW w:type="dxa" w:w="1728"/>
           </w:tcPr>
           <w:p>
             <w:r>
               <w:t>29.0%</w:t>
+            </w:r>
+          </w:p>
+        </w:tc>
+        <w:tc>
+          <w:tcPr>
+            <w:tcW w:type="dxa" w:w="1728"/>
+          </w:tcPr>
+          <w:p>
+            <w:r>
+              <w:t>24.6–33.4</w:t>
             </w:r>
           </w:p>
         </w:tc>
@@ -972,7 +1164,7 @@
     </w:p>
     <w:p>
       <w:r>
-        <w:t>Ish joyida yuqori harorat 47.5% va yuqori shovqin 50.2% deklaratsiya qilingan. 43.2% xodim tez-tez jismoniy charchoq, 31.8% asabiylashish belgilaydi. Bu omillar EnergoHealth-Predict tizimida kelajakdagi kasallanish xavfini oshiruvchi signallar sifatida hisobga olinadi.</w:t>
+        <w:t>Ish joyida yuqori harorat 47.5% va yuqori shovqin 50.2% deklaratsiya qilingan. 43.2% xodim tez-tez jismoniy charchoq, 31.8% asabiylashish belgilaydi. Bu omillar Noinfeksion kardiologik xavflarni prognozlash va monitoring qilish milliy-ilmiy ko'p rolli portali tizimida kelajakdagi kasallanish xavfini oshiruvchi signallar sifatida hisobga olinadi.</w:t>
       </w:r>
     </w:p>
     <w:tbl>
@@ -982,15 +1174,16 @@
         <w:tblLook w:firstColumn="1" w:firstRow="1" w:lastColumn="0" w:lastRow="0" w:noHBand="0" w:noVBand="1" w:val="04A0"/>
       </w:tblPr>
       <w:tblGrid>
-        <w:gridCol w:w="2160"/>
-        <w:gridCol w:w="2160"/>
-        <w:gridCol w:w="2160"/>
-        <w:gridCol w:w="2160"/>
+        <w:gridCol w:w="1728"/>
+        <w:gridCol w:w="1728"/>
+        <w:gridCol w:w="1728"/>
+        <w:gridCol w:w="1728"/>
+        <w:gridCol w:w="1728"/>
       </w:tblGrid>
       <w:tr>
         <w:tc>
           <w:tcPr>
-            <w:tcW w:type="dxa" w:w="2160"/>
+            <w:tcW w:type="dxa" w:w="1728"/>
           </w:tcPr>
           <w:p>
             <w:r>
@@ -1000,7 +1193,7 @@
         </w:tc>
         <w:tc>
           <w:tcPr>
-            <w:tcW w:type="dxa" w:w="2160"/>
+            <w:tcW w:type="dxa" w:w="1728"/>
           </w:tcPr>
           <w:p>
             <w:r>
@@ -1010,7 +1203,7 @@
         </w:tc>
         <w:tc>
           <w:tcPr>
-            <w:tcW w:type="dxa" w:w="2160"/>
+            <w:tcW w:type="dxa" w:w="1728"/>
           </w:tcPr>
           <w:p>
             <w:r>
@@ -1020,11 +1213,21 @@
         </w:tc>
         <w:tc>
           <w:tcPr>
-            <w:tcW w:type="dxa" w:w="2160"/>
+            <w:tcW w:type="dxa" w:w="1728"/>
           </w:tcPr>
           <w:p>
             <w:r>
               <w:t>%</w:t>
+            </w:r>
+          </w:p>
+        </w:tc>
+        <w:tc>
+          <w:tcPr>
+            <w:tcW w:type="dxa" w:w="1728"/>
+          </w:tcPr>
+          <w:p>
+            <w:r>
+              <w:t>95% CI</w:t>
             </w:r>
           </w:p>
         </w:tc>
@@ -1032,7 +1235,7 @@
       <w:tr>
         <w:tc>
           <w:tcPr>
-            <w:tcW w:type="dxa" w:w="2160"/>
+            <w:tcW w:type="dxa" w:w="1728"/>
           </w:tcPr>
           <w:p>
             <w:r>
@@ -1042,7 +1245,7 @@
         </w:tc>
         <w:tc>
           <w:tcPr>
-            <w:tcW w:type="dxa" w:w="2160"/>
+            <w:tcW w:type="dxa" w:w="1728"/>
           </w:tcPr>
           <w:p>
             <w:r>
@@ -1052,7 +1255,7 @@
         </w:tc>
         <w:tc>
           <w:tcPr>
-            <w:tcW w:type="dxa" w:w="2160"/>
+            <w:tcW w:type="dxa" w:w="1728"/>
           </w:tcPr>
           <w:p>
             <w:r>
@@ -1062,11 +1265,21 @@
         </w:tc>
         <w:tc>
           <w:tcPr>
-            <w:tcW w:type="dxa" w:w="2160"/>
+            <w:tcW w:type="dxa" w:w="1728"/>
           </w:tcPr>
           <w:p>
             <w:r>
               <w:t>50.2%</w:t>
+            </w:r>
+          </w:p>
+        </w:tc>
+        <w:tc>
+          <w:tcPr>
+            <w:tcW w:type="dxa" w:w="1728"/>
+          </w:tcPr>
+          <w:p>
+            <w:r>
+              <w:t>45.4–55.1</w:t>
             </w:r>
           </w:p>
         </w:tc>
@@ -1074,7 +1287,7 @@
       <w:tr>
         <w:tc>
           <w:tcPr>
-            <w:tcW w:type="dxa" w:w="2160"/>
+            <w:tcW w:type="dxa" w:w="1728"/>
           </w:tcPr>
           <w:p>
             <w:r>
@@ -1084,7 +1297,7 @@
         </w:tc>
         <w:tc>
           <w:tcPr>
-            <w:tcW w:type="dxa" w:w="2160"/>
+            <w:tcW w:type="dxa" w:w="1728"/>
           </w:tcPr>
           <w:p>
             <w:r>
@@ -1094,7 +1307,7 @@
         </w:tc>
         <w:tc>
           <w:tcPr>
-            <w:tcW w:type="dxa" w:w="2160"/>
+            <w:tcW w:type="dxa" w:w="1728"/>
           </w:tcPr>
           <w:p>
             <w:r>
@@ -1104,11 +1317,21 @@
         </w:tc>
         <w:tc>
           <w:tcPr>
-            <w:tcW w:type="dxa" w:w="2160"/>
+            <w:tcW w:type="dxa" w:w="1728"/>
           </w:tcPr>
           <w:p>
             <w:r>
               <w:t>49.8%</w:t>
+            </w:r>
+          </w:p>
+        </w:tc>
+        <w:tc>
+          <w:tcPr>
+            <w:tcW w:type="dxa" w:w="1728"/>
+          </w:tcPr>
+          <w:p>
+            <w:r>
+              <w:t>44.9–54.6</w:t>
             </w:r>
           </w:p>
         </w:tc>
@@ -1116,7 +1339,7 @@
       <w:tr>
         <w:tc>
           <w:tcPr>
-            <w:tcW w:type="dxa" w:w="2160"/>
+            <w:tcW w:type="dxa" w:w="1728"/>
           </w:tcPr>
           <w:p>
             <w:r>
@@ -1126,7 +1349,7 @@
         </w:tc>
         <w:tc>
           <w:tcPr>
-            <w:tcW w:type="dxa" w:w="2160"/>
+            <w:tcW w:type="dxa" w:w="1728"/>
           </w:tcPr>
           <w:p>
             <w:r>
@@ -1136,7 +1359,7 @@
         </w:tc>
         <w:tc>
           <w:tcPr>
-            <w:tcW w:type="dxa" w:w="2160"/>
+            <w:tcW w:type="dxa" w:w="1728"/>
           </w:tcPr>
           <w:p>
             <w:r>
@@ -1146,11 +1369,21 @@
         </w:tc>
         <w:tc>
           <w:tcPr>
-            <w:tcW w:type="dxa" w:w="2160"/>
+            <w:tcW w:type="dxa" w:w="1728"/>
           </w:tcPr>
           <w:p>
             <w:r>
               <w:t>47.5%</w:t>
+            </w:r>
+          </w:p>
+        </w:tc>
+        <w:tc>
+          <w:tcPr>
+            <w:tcW w:type="dxa" w:w="1728"/>
+          </w:tcPr>
+          <w:p>
+            <w:r>
+              <w:t>42.6–52.4</w:t>
             </w:r>
           </w:p>
         </w:tc>
@@ -1158,7 +1391,7 @@
       <w:tr>
         <w:tc>
           <w:tcPr>
-            <w:tcW w:type="dxa" w:w="2160"/>
+            <w:tcW w:type="dxa" w:w="1728"/>
           </w:tcPr>
           <w:p>
             <w:r>
@@ -1168,7 +1401,7 @@
         </w:tc>
         <w:tc>
           <w:tcPr>
-            <w:tcW w:type="dxa" w:w="2160"/>
+            <w:tcW w:type="dxa" w:w="1728"/>
           </w:tcPr>
           <w:p>
             <w:r>
@@ -1178,7 +1411,7 @@
         </w:tc>
         <w:tc>
           <w:tcPr>
-            <w:tcW w:type="dxa" w:w="2160"/>
+            <w:tcW w:type="dxa" w:w="1728"/>
           </w:tcPr>
           <w:p>
             <w:r>
@@ -1188,11 +1421,21 @@
         </w:tc>
         <w:tc>
           <w:tcPr>
-            <w:tcW w:type="dxa" w:w="2160"/>
+            <w:tcW w:type="dxa" w:w="1728"/>
           </w:tcPr>
           <w:p>
             <w:r>
               <w:t>58.5%</w:t>
+            </w:r>
+          </w:p>
+        </w:tc>
+        <w:tc>
+          <w:tcPr>
+            <w:tcW w:type="dxa" w:w="1728"/>
+          </w:tcPr>
+          <w:p>
+            <w:r>
+              <w:t>53.7–63.3</w:t>
             </w:r>
           </w:p>
         </w:tc>
@@ -1200,7 +1443,7 @@
       <w:tr>
         <w:tc>
           <w:tcPr>
-            <w:tcW w:type="dxa" w:w="2160"/>
+            <w:tcW w:type="dxa" w:w="1728"/>
           </w:tcPr>
           <w:p>
             <w:r>
@@ -1210,7 +1453,7 @@
         </w:tc>
         <w:tc>
           <w:tcPr>
-            <w:tcW w:type="dxa" w:w="2160"/>
+            <w:tcW w:type="dxa" w:w="1728"/>
           </w:tcPr>
           <w:p>
             <w:r>
@@ -1220,7 +1463,7 @@
         </w:tc>
         <w:tc>
           <w:tcPr>
-            <w:tcW w:type="dxa" w:w="2160"/>
+            <w:tcW w:type="dxa" w:w="1728"/>
           </w:tcPr>
           <w:p>
             <w:r>
@@ -1230,11 +1473,21 @@
         </w:tc>
         <w:tc>
           <w:tcPr>
-            <w:tcW w:type="dxa" w:w="2160"/>
+            <w:tcW w:type="dxa" w:w="1728"/>
           </w:tcPr>
           <w:p>
             <w:r>
               <w:t>39.8%</w:t>
+            </w:r>
+          </w:p>
+        </w:tc>
+        <w:tc>
+          <w:tcPr>
+            <w:tcW w:type="dxa" w:w="1728"/>
+          </w:tcPr>
+          <w:p>
+            <w:r>
+              <w:t>35.0–44.5</w:t>
             </w:r>
           </w:p>
         </w:tc>
@@ -1242,7 +1495,7 @@
       <w:tr>
         <w:tc>
           <w:tcPr>
-            <w:tcW w:type="dxa" w:w="2160"/>
+            <w:tcW w:type="dxa" w:w="1728"/>
           </w:tcPr>
           <w:p>
             <w:r>
@@ -1252,7 +1505,7 @@
         </w:tc>
         <w:tc>
           <w:tcPr>
-            <w:tcW w:type="dxa" w:w="2160"/>
+            <w:tcW w:type="dxa" w:w="1728"/>
           </w:tcPr>
           <w:p>
             <w:r>
@@ -1262,7 +1515,7 @@
         </w:tc>
         <w:tc>
           <w:tcPr>
-            <w:tcW w:type="dxa" w:w="2160"/>
+            <w:tcW w:type="dxa" w:w="1728"/>
           </w:tcPr>
           <w:p>
             <w:r>
@@ -1272,11 +1525,21 @@
         </w:tc>
         <w:tc>
           <w:tcPr>
-            <w:tcW w:type="dxa" w:w="2160"/>
+            <w:tcW w:type="dxa" w:w="1728"/>
           </w:tcPr>
           <w:p>
             <w:r>
               <w:t>37.8%</w:t>
+            </w:r>
+          </w:p>
+        </w:tc>
+        <w:tc>
+          <w:tcPr>
+            <w:tcW w:type="dxa" w:w="1728"/>
+          </w:tcPr>
+          <w:p>
+            <w:r>
+              <w:t>33.0–42.5</w:t>
             </w:r>
           </w:p>
         </w:tc>
@@ -1284,7 +1547,7 @@
       <w:tr>
         <w:tc>
           <w:tcPr>
-            <w:tcW w:type="dxa" w:w="2160"/>
+            <w:tcW w:type="dxa" w:w="1728"/>
           </w:tcPr>
           <w:p>
             <w:r>
@@ -1294,7 +1557,7 @@
         </w:tc>
         <w:tc>
           <w:tcPr>
-            <w:tcW w:type="dxa" w:w="2160"/>
+            <w:tcW w:type="dxa" w:w="1728"/>
           </w:tcPr>
           <w:p>
             <w:r>
@@ -1304,7 +1567,7 @@
         </w:tc>
         <w:tc>
           <w:tcPr>
-            <w:tcW w:type="dxa" w:w="2160"/>
+            <w:tcW w:type="dxa" w:w="1728"/>
           </w:tcPr>
           <w:p>
             <w:r>
@@ -1314,11 +1577,21 @@
         </w:tc>
         <w:tc>
           <w:tcPr>
-            <w:tcW w:type="dxa" w:w="2160"/>
+            <w:tcW w:type="dxa" w:w="1728"/>
           </w:tcPr>
           <w:p>
             <w:r>
               <w:t>36.0%</w:t>
+            </w:r>
+          </w:p>
+        </w:tc>
+        <w:tc>
+          <w:tcPr>
+            <w:tcW w:type="dxa" w:w="1728"/>
+          </w:tcPr>
+          <w:p>
+            <w:r>
+              <w:t>31.3–40.7</w:t>
             </w:r>
           </w:p>
         </w:tc>
@@ -1326,7 +1599,7 @@
       <w:tr>
         <w:tc>
           <w:tcPr>
-            <w:tcW w:type="dxa" w:w="2160"/>
+            <w:tcW w:type="dxa" w:w="1728"/>
           </w:tcPr>
           <w:p>
             <w:r>
@@ -1336,7 +1609,7 @@
         </w:tc>
         <w:tc>
           <w:tcPr>
-            <w:tcW w:type="dxa" w:w="2160"/>
+            <w:tcW w:type="dxa" w:w="1728"/>
           </w:tcPr>
           <w:p>
             <w:r>
@@ -1346,7 +1619,7 @@
         </w:tc>
         <w:tc>
           <w:tcPr>
-            <w:tcW w:type="dxa" w:w="2160"/>
+            <w:tcW w:type="dxa" w:w="1728"/>
           </w:tcPr>
           <w:p>
             <w:r>
@@ -1356,11 +1629,21 @@
         </w:tc>
         <w:tc>
           <w:tcPr>
-            <w:tcW w:type="dxa" w:w="2160"/>
+            <w:tcW w:type="dxa" w:w="1728"/>
           </w:tcPr>
           <w:p>
             <w:r>
               <w:t>56.8%</w:t>
+            </w:r>
+          </w:p>
+        </w:tc>
+        <w:tc>
+          <w:tcPr>
+            <w:tcW w:type="dxa" w:w="1728"/>
+          </w:tcPr>
+          <w:p>
+            <w:r>
+              <w:t>51.9–61.6</w:t>
             </w:r>
           </w:p>
         </w:tc>
@@ -1368,7 +1651,7 @@
       <w:tr>
         <w:tc>
           <w:tcPr>
-            <w:tcW w:type="dxa" w:w="2160"/>
+            <w:tcW w:type="dxa" w:w="1728"/>
           </w:tcPr>
           <w:p>
             <w:r>
@@ -1378,7 +1661,7 @@
         </w:tc>
         <w:tc>
           <w:tcPr>
-            <w:tcW w:type="dxa" w:w="2160"/>
+            <w:tcW w:type="dxa" w:w="1728"/>
           </w:tcPr>
           <w:p>
             <w:r>
@@ -1388,7 +1671,7 @@
         </w:tc>
         <w:tc>
           <w:tcPr>
-            <w:tcW w:type="dxa" w:w="2160"/>
+            <w:tcW w:type="dxa" w:w="1728"/>
           </w:tcPr>
           <w:p>
             <w:r>
@@ -1398,11 +1681,21 @@
         </w:tc>
         <w:tc>
           <w:tcPr>
-            <w:tcW w:type="dxa" w:w="2160"/>
+            <w:tcW w:type="dxa" w:w="1728"/>
           </w:tcPr>
           <w:p>
             <w:r>
               <w:t>43.2%</w:t>
+            </w:r>
+          </w:p>
+        </w:tc>
+        <w:tc>
+          <w:tcPr>
+            <w:tcW w:type="dxa" w:w="1728"/>
+          </w:tcPr>
+          <w:p>
+            <w:r>
+              <w:t>38.4–48.1</w:t>
             </w:r>
           </w:p>
         </w:tc>
@@ -1410,7 +1703,7 @@
       <w:tr>
         <w:tc>
           <w:tcPr>
-            <w:tcW w:type="dxa" w:w="2160"/>
+            <w:tcW w:type="dxa" w:w="1728"/>
           </w:tcPr>
           <w:p>
             <w:r>
@@ -1420,7 +1713,7 @@
         </w:tc>
         <w:tc>
           <w:tcPr>
-            <w:tcW w:type="dxa" w:w="2160"/>
+            <w:tcW w:type="dxa" w:w="1728"/>
           </w:tcPr>
           <w:p>
             <w:r>
@@ -1430,7 +1723,7 @@
         </w:tc>
         <w:tc>
           <w:tcPr>
-            <w:tcW w:type="dxa" w:w="2160"/>
+            <w:tcW w:type="dxa" w:w="1728"/>
           </w:tcPr>
           <w:p>
             <w:r>
@@ -1440,11 +1733,21 @@
         </w:tc>
         <w:tc>
           <w:tcPr>
-            <w:tcW w:type="dxa" w:w="2160"/>
+            <w:tcW w:type="dxa" w:w="1728"/>
           </w:tcPr>
           <w:p>
             <w:r>
               <w:t>31.8%</w:t>
+            </w:r>
+          </w:p>
+        </w:tc>
+        <w:tc>
+          <w:tcPr>
+            <w:tcW w:type="dxa" w:w="1728"/>
+          </w:tcPr>
+          <w:p>
+            <w:r>
+              <w:t>27.2–36.3</w:t>
             </w:r>
           </w:p>
         </w:tc>
@@ -1452,7 +1755,7 @@
       <w:tr>
         <w:tc>
           <w:tcPr>
-            <w:tcW w:type="dxa" w:w="2160"/>
+            <w:tcW w:type="dxa" w:w="1728"/>
           </w:tcPr>
           <w:p>
             <w:r>
@@ -1462,7 +1765,7 @@
         </w:tc>
         <w:tc>
           <w:tcPr>
-            <w:tcW w:type="dxa" w:w="2160"/>
+            <w:tcW w:type="dxa" w:w="1728"/>
           </w:tcPr>
           <w:p>
             <w:r>
@@ -1472,7 +1775,7 @@
         </w:tc>
         <w:tc>
           <w:tcPr>
-            <w:tcW w:type="dxa" w:w="2160"/>
+            <w:tcW w:type="dxa" w:w="1728"/>
           </w:tcPr>
           <w:p>
             <w:r>
@@ -1482,11 +1785,21 @@
         </w:tc>
         <w:tc>
           <w:tcPr>
-            <w:tcW w:type="dxa" w:w="2160"/>
+            <w:tcW w:type="dxa" w:w="1728"/>
           </w:tcPr>
           <w:p>
             <w:r>
               <w:t>56.5%</w:t>
+            </w:r>
+          </w:p>
+        </w:tc>
+        <w:tc>
+          <w:tcPr>
+            <w:tcW w:type="dxa" w:w="1728"/>
+          </w:tcPr>
+          <w:p>
+            <w:r>
+              <w:t>51.6–61.4</w:t>
             </w:r>
           </w:p>
         </w:tc>
@@ -1494,7 +1807,7 @@
       <w:tr>
         <w:tc>
           <w:tcPr>
-            <w:tcW w:type="dxa" w:w="2160"/>
+            <w:tcW w:type="dxa" w:w="1728"/>
           </w:tcPr>
           <w:p>
             <w:r>
@@ -1504,7 +1817,7 @@
         </w:tc>
         <w:tc>
           <w:tcPr>
-            <w:tcW w:type="dxa" w:w="2160"/>
+            <w:tcW w:type="dxa" w:w="1728"/>
           </w:tcPr>
           <w:p>
             <w:r>
@@ -1514,7 +1827,7 @@
         </w:tc>
         <w:tc>
           <w:tcPr>
-            <w:tcW w:type="dxa" w:w="2160"/>
+            <w:tcW w:type="dxa" w:w="1728"/>
           </w:tcPr>
           <w:p>
             <w:r>
@@ -1524,11 +1837,21 @@
         </w:tc>
         <w:tc>
           <w:tcPr>
-            <w:tcW w:type="dxa" w:w="2160"/>
+            <w:tcW w:type="dxa" w:w="1728"/>
           </w:tcPr>
           <w:p>
             <w:r>
               <w:t>34.5%</w:t>
+            </w:r>
+          </w:p>
+        </w:tc>
+        <w:tc>
+          <w:tcPr>
+            <w:tcW w:type="dxa" w:w="1728"/>
+          </w:tcPr>
+          <w:p>
+            <w:r>
+              <w:t>29.8–39.2</w:t>
             </w:r>
           </w:p>
         </w:tc>
@@ -1536,7 +1859,7 @@
       <w:tr>
         <w:tc>
           <w:tcPr>
-            <w:tcW w:type="dxa" w:w="2160"/>
+            <w:tcW w:type="dxa" w:w="1728"/>
           </w:tcPr>
           <w:p>
             <w:r>
@@ -1546,7 +1869,7 @@
         </w:tc>
         <w:tc>
           <w:tcPr>
-            <w:tcW w:type="dxa" w:w="2160"/>
+            <w:tcW w:type="dxa" w:w="1728"/>
           </w:tcPr>
           <w:p>
             <w:r>
@@ -1556,7 +1879,7 @@
         </w:tc>
         <w:tc>
           <w:tcPr>
-            <w:tcW w:type="dxa" w:w="2160"/>
+            <w:tcW w:type="dxa" w:w="1728"/>
           </w:tcPr>
           <w:p>
             <w:r>
@@ -1566,11 +1889,21 @@
         </w:tc>
         <w:tc>
           <w:tcPr>
-            <w:tcW w:type="dxa" w:w="2160"/>
+            <w:tcW w:type="dxa" w:w="1728"/>
           </w:tcPr>
           <w:p>
             <w:r>
               <w:t>30.5%</w:t>
+            </w:r>
+          </w:p>
+        </w:tc>
+        <w:tc>
+          <w:tcPr>
+            <w:tcW w:type="dxa" w:w="1728"/>
+          </w:tcPr>
+          <w:p>
+            <w:r>
+              <w:t>26.0–35.0</w:t>
             </w:r>
           </w:p>
         </w:tc>
@@ -1578,7 +1911,7 @@
       <w:tr>
         <w:tc>
           <w:tcPr>
-            <w:tcW w:type="dxa" w:w="2160"/>
+            <w:tcW w:type="dxa" w:w="1728"/>
           </w:tcPr>
           <w:p>
             <w:r>
@@ -1588,7 +1921,7 @@
         </w:tc>
         <w:tc>
           <w:tcPr>
-            <w:tcW w:type="dxa" w:w="2160"/>
+            <w:tcW w:type="dxa" w:w="1728"/>
           </w:tcPr>
           <w:p>
             <w:r>
@@ -1598,7 +1931,7 @@
         </w:tc>
         <w:tc>
           <w:tcPr>
-            <w:tcW w:type="dxa" w:w="2160"/>
+            <w:tcW w:type="dxa" w:w="1728"/>
           </w:tcPr>
           <w:p>
             <w:r>
@@ -1608,11 +1941,21 @@
         </w:tc>
         <w:tc>
           <w:tcPr>
-            <w:tcW w:type="dxa" w:w="2160"/>
+            <w:tcW w:type="dxa" w:w="1728"/>
           </w:tcPr>
           <w:p>
             <w:r>
               <w:t>48.0%</w:t>
+            </w:r>
+          </w:p>
+        </w:tc>
+        <w:tc>
+          <w:tcPr>
+            <w:tcW w:type="dxa" w:w="1728"/>
+          </w:tcPr>
+          <w:p>
+            <w:r>
+              <w:t>43.1–52.9</w:t>
             </w:r>
           </w:p>
         </w:tc>
@@ -1620,7 +1963,7 @@
       <w:tr>
         <w:tc>
           <w:tcPr>
-            <w:tcW w:type="dxa" w:w="2160"/>
+            <w:tcW w:type="dxa" w:w="1728"/>
           </w:tcPr>
           <w:p>
             <w:r>
@@ -1630,7 +1973,7 @@
         </w:tc>
         <w:tc>
           <w:tcPr>
-            <w:tcW w:type="dxa" w:w="2160"/>
+            <w:tcW w:type="dxa" w:w="1728"/>
           </w:tcPr>
           <w:p>
             <w:r>
@@ -1640,7 +1983,7 @@
         </w:tc>
         <w:tc>
           <w:tcPr>
-            <w:tcW w:type="dxa" w:w="2160"/>
+            <w:tcW w:type="dxa" w:w="1728"/>
           </w:tcPr>
           <w:p>
             <w:r>
@@ -1650,11 +1993,21 @@
         </w:tc>
         <w:tc>
           <w:tcPr>
-            <w:tcW w:type="dxa" w:w="2160"/>
+            <w:tcW w:type="dxa" w:w="1728"/>
           </w:tcPr>
           <w:p>
             <w:r>
               <w:t>46.0%</w:t>
+            </w:r>
+          </w:p>
+        </w:tc>
+        <w:tc>
+          <w:tcPr>
+            <w:tcW w:type="dxa" w:w="1728"/>
+          </w:tcPr>
+          <w:p>
+            <w:r>
+              <w:t>41.1–50.9</w:t>
             </w:r>
           </w:p>
         </w:tc>
@@ -1726,15 +2079,16 @@
         <w:tblLook w:firstColumn="1" w:firstRow="1" w:lastColumn="0" w:lastRow="0" w:noHBand="0" w:noVBand="1" w:val="04A0"/>
       </w:tblPr>
       <w:tblGrid>
-        <w:gridCol w:w="2160"/>
-        <w:gridCol w:w="2160"/>
-        <w:gridCol w:w="2160"/>
-        <w:gridCol w:w="2160"/>
+        <w:gridCol w:w="1728"/>
+        <w:gridCol w:w="1728"/>
+        <w:gridCol w:w="1728"/>
+        <w:gridCol w:w="1728"/>
+        <w:gridCol w:w="1728"/>
       </w:tblGrid>
       <w:tr>
         <w:tc>
           <w:tcPr>
-            <w:tcW w:type="dxa" w:w="2160"/>
+            <w:tcW w:type="dxa" w:w="1728"/>
           </w:tcPr>
           <w:p>
             <w:r>
@@ -1744,7 +2098,7 @@
         </w:tc>
         <w:tc>
           <w:tcPr>
-            <w:tcW w:type="dxa" w:w="2160"/>
+            <w:tcW w:type="dxa" w:w="1728"/>
           </w:tcPr>
           <w:p>
             <w:r>
@@ -1754,7 +2108,7 @@
         </w:tc>
         <w:tc>
           <w:tcPr>
-            <w:tcW w:type="dxa" w:w="2160"/>
+            <w:tcW w:type="dxa" w:w="1728"/>
           </w:tcPr>
           <w:p>
             <w:r>
@@ -1764,11 +2118,21 @@
         </w:tc>
         <w:tc>
           <w:tcPr>
-            <w:tcW w:type="dxa" w:w="2160"/>
+            <w:tcW w:type="dxa" w:w="1728"/>
           </w:tcPr>
           <w:p>
             <w:r>
               <w:t>%</w:t>
+            </w:r>
+          </w:p>
+        </w:tc>
+        <w:tc>
+          <w:tcPr>
+            <w:tcW w:type="dxa" w:w="1728"/>
+          </w:tcPr>
+          <w:p>
+            <w:r>
+              <w:t>95% CI</w:t>
             </w:r>
           </w:p>
         </w:tc>
@@ -1776,7 +2140,7 @@
       <w:tr>
         <w:tc>
           <w:tcPr>
-            <w:tcW w:type="dxa" w:w="2160"/>
+            <w:tcW w:type="dxa" w:w="1728"/>
           </w:tcPr>
           <w:p>
             <w:r>
@@ -1786,7 +2150,7 @@
         </w:tc>
         <w:tc>
           <w:tcPr>
-            <w:tcW w:type="dxa" w:w="2160"/>
+            <w:tcW w:type="dxa" w:w="1728"/>
           </w:tcPr>
           <w:p>
             <w:r>
@@ -1796,7 +2160,7 @@
         </w:tc>
         <w:tc>
           <w:tcPr>
-            <w:tcW w:type="dxa" w:w="2160"/>
+            <w:tcW w:type="dxa" w:w="1728"/>
           </w:tcPr>
           <w:p>
             <w:r>
@@ -1806,11 +2170,21 @@
         </w:tc>
         <w:tc>
           <w:tcPr>
-            <w:tcW w:type="dxa" w:w="2160"/>
+            <w:tcW w:type="dxa" w:w="1728"/>
           </w:tcPr>
           <w:p>
             <w:r>
               <w:t>30.0%</w:t>
+            </w:r>
+          </w:p>
+        </w:tc>
+        <w:tc>
+          <w:tcPr>
+            <w:tcW w:type="dxa" w:w="1728"/>
+          </w:tcPr>
+          <w:p>
+            <w:r>
+              <w:t>25.5–34.5</w:t>
             </w:r>
           </w:p>
         </w:tc>
@@ -1818,7 +2192,7 @@
       <w:tr>
         <w:tc>
           <w:tcPr>
-            <w:tcW w:type="dxa" w:w="2160"/>
+            <w:tcW w:type="dxa" w:w="1728"/>
           </w:tcPr>
           <w:p>
             <w:r>
@@ -1828,7 +2202,7 @@
         </w:tc>
         <w:tc>
           <w:tcPr>
-            <w:tcW w:type="dxa" w:w="2160"/>
+            <w:tcW w:type="dxa" w:w="1728"/>
           </w:tcPr>
           <w:p>
             <w:r>
@@ -1838,7 +2212,7 @@
         </w:tc>
         <w:tc>
           <w:tcPr>
-            <w:tcW w:type="dxa" w:w="2160"/>
+            <w:tcW w:type="dxa" w:w="1728"/>
           </w:tcPr>
           <w:p>
             <w:r>
@@ -1848,11 +2222,21 @@
         </w:tc>
         <w:tc>
           <w:tcPr>
-            <w:tcW w:type="dxa" w:w="2160"/>
+            <w:tcW w:type="dxa" w:w="1728"/>
           </w:tcPr>
           <w:p>
             <w:r>
               <w:t>55.0%</w:t>
+            </w:r>
+          </w:p>
+        </w:tc>
+        <w:tc>
+          <w:tcPr>
+            <w:tcW w:type="dxa" w:w="1728"/>
+          </w:tcPr>
+          <w:p>
+            <w:r>
+              <w:t>50.1–59.9</w:t>
             </w:r>
           </w:p>
         </w:tc>
@@ -1860,7 +2244,7 @@
       <w:tr>
         <w:tc>
           <w:tcPr>
-            <w:tcW w:type="dxa" w:w="2160"/>
+            <w:tcW w:type="dxa" w:w="1728"/>
           </w:tcPr>
           <w:p>
             <w:r>
@@ -1870,7 +2254,7 @@
         </w:tc>
         <w:tc>
           <w:tcPr>
-            <w:tcW w:type="dxa" w:w="2160"/>
+            <w:tcW w:type="dxa" w:w="1728"/>
           </w:tcPr>
           <w:p>
             <w:r>
@@ -1880,7 +2264,7 @@
         </w:tc>
         <w:tc>
           <w:tcPr>
-            <w:tcW w:type="dxa" w:w="2160"/>
+            <w:tcW w:type="dxa" w:w="1728"/>
           </w:tcPr>
           <w:p>
             <w:r>
@@ -1890,11 +2274,21 @@
         </w:tc>
         <w:tc>
           <w:tcPr>
-            <w:tcW w:type="dxa" w:w="2160"/>
+            <w:tcW w:type="dxa" w:w="1728"/>
           </w:tcPr>
           <w:p>
             <w:r>
               <w:t>11.0%</w:t>
+            </w:r>
+          </w:p>
+        </w:tc>
+        <w:tc>
+          <w:tcPr>
+            <w:tcW w:type="dxa" w:w="1728"/>
+          </w:tcPr>
+          <w:p>
+            <w:r>
+              <w:t>7.9–14.1</w:t>
             </w:r>
           </w:p>
         </w:tc>
@@ -1902,7 +2296,7 @@
       <w:tr>
         <w:tc>
           <w:tcPr>
-            <w:tcW w:type="dxa" w:w="2160"/>
+            <w:tcW w:type="dxa" w:w="1728"/>
           </w:tcPr>
           <w:p>
             <w:r>
@@ -1912,7 +2306,7 @@
         </w:tc>
         <w:tc>
           <w:tcPr>
-            <w:tcW w:type="dxa" w:w="2160"/>
+            <w:tcW w:type="dxa" w:w="1728"/>
           </w:tcPr>
           <w:p>
             <w:r>
@@ -1922,7 +2316,7 @@
         </w:tc>
         <w:tc>
           <w:tcPr>
-            <w:tcW w:type="dxa" w:w="2160"/>
+            <w:tcW w:type="dxa" w:w="1728"/>
           </w:tcPr>
           <w:p>
             <w:r>
@@ -1932,11 +2326,21 @@
         </w:tc>
         <w:tc>
           <w:tcPr>
-            <w:tcW w:type="dxa" w:w="2160"/>
+            <w:tcW w:type="dxa" w:w="1728"/>
           </w:tcPr>
           <w:p>
             <w:r>
               <w:t>55.2%</w:t>
+            </w:r>
+          </w:p>
+        </w:tc>
+        <w:tc>
+          <w:tcPr>
+            <w:tcW w:type="dxa" w:w="1728"/>
+          </w:tcPr>
+          <w:p>
+            <w:r>
+              <w:t>50.4–60.1</w:t>
             </w:r>
           </w:p>
         </w:tc>
@@ -1944,7 +2348,7 @@
       <w:tr>
         <w:tc>
           <w:tcPr>
-            <w:tcW w:type="dxa" w:w="2160"/>
+            <w:tcW w:type="dxa" w:w="1728"/>
           </w:tcPr>
           <w:p>
             <w:r>
@@ -1954,7 +2358,7 @@
         </w:tc>
         <w:tc>
           <w:tcPr>
-            <w:tcW w:type="dxa" w:w="2160"/>
+            <w:tcW w:type="dxa" w:w="1728"/>
           </w:tcPr>
           <w:p>
             <w:r>
@@ -1964,7 +2368,7 @@
         </w:tc>
         <w:tc>
           <w:tcPr>
-            <w:tcW w:type="dxa" w:w="2160"/>
+            <w:tcW w:type="dxa" w:w="1728"/>
           </w:tcPr>
           <w:p>
             <w:r>
@@ -1974,11 +2378,21 @@
         </w:tc>
         <w:tc>
           <w:tcPr>
-            <w:tcW w:type="dxa" w:w="2160"/>
+            <w:tcW w:type="dxa" w:w="1728"/>
           </w:tcPr>
           <w:p>
             <w:r>
               <w:t>63.2%</w:t>
+            </w:r>
+          </w:p>
+        </w:tc>
+        <w:tc>
+          <w:tcPr>
+            <w:tcW w:type="dxa" w:w="1728"/>
+          </w:tcPr>
+          <w:p>
+            <w:r>
+              <w:t>58.5–68.0</w:t>
             </w:r>
           </w:p>
         </w:tc>
@@ -1986,7 +2400,7 @@
       <w:tr>
         <w:tc>
           <w:tcPr>
-            <w:tcW w:type="dxa" w:w="2160"/>
+            <w:tcW w:type="dxa" w:w="1728"/>
           </w:tcPr>
           <w:p>
             <w:r>
@@ -1996,7 +2410,7 @@
         </w:tc>
         <w:tc>
           <w:tcPr>
-            <w:tcW w:type="dxa" w:w="2160"/>
+            <w:tcW w:type="dxa" w:w="1728"/>
           </w:tcPr>
           <w:p>
             <w:r>
@@ -2006,7 +2420,7 @@
         </w:tc>
         <w:tc>
           <w:tcPr>
-            <w:tcW w:type="dxa" w:w="2160"/>
+            <w:tcW w:type="dxa" w:w="1728"/>
           </w:tcPr>
           <w:p>
             <w:r>
@@ -2016,11 +2430,21 @@
         </w:tc>
         <w:tc>
           <w:tcPr>
-            <w:tcW w:type="dxa" w:w="2160"/>
+            <w:tcW w:type="dxa" w:w="1728"/>
           </w:tcPr>
           <w:p>
             <w:r>
               <w:t>20.5%</w:t>
+            </w:r>
+          </w:p>
+        </w:tc>
+        <w:tc>
+          <w:tcPr>
+            <w:tcW w:type="dxa" w:w="1728"/>
+          </w:tcPr>
+          <w:p>
+            <w:r>
+              <w:t>16.5–24.5</w:t>
             </w:r>
           </w:p>
         </w:tc>
@@ -2028,7 +2452,7 @@
       <w:tr>
         <w:tc>
           <w:tcPr>
-            <w:tcW w:type="dxa" w:w="2160"/>
+            <w:tcW w:type="dxa" w:w="1728"/>
           </w:tcPr>
           <w:p>
             <w:r>
@@ -2038,7 +2462,7 @@
         </w:tc>
         <w:tc>
           <w:tcPr>
-            <w:tcW w:type="dxa" w:w="2160"/>
+            <w:tcW w:type="dxa" w:w="1728"/>
           </w:tcPr>
           <w:p>
             <w:r>
@@ -2048,7 +2472,7 @@
         </w:tc>
         <w:tc>
           <w:tcPr>
-            <w:tcW w:type="dxa" w:w="2160"/>
+            <w:tcW w:type="dxa" w:w="1728"/>
           </w:tcPr>
           <w:p>
             <w:r>
@@ -2058,11 +2482,21 @@
         </w:tc>
         <w:tc>
           <w:tcPr>
-            <w:tcW w:type="dxa" w:w="2160"/>
+            <w:tcW w:type="dxa" w:w="1728"/>
           </w:tcPr>
           <w:p>
             <w:r>
               <w:t>11.8%</w:t>
+            </w:r>
+          </w:p>
+        </w:tc>
+        <w:tc>
+          <w:tcPr>
+            <w:tcW w:type="dxa" w:w="1728"/>
+          </w:tcPr>
+          <w:p>
+            <w:r>
+              <w:t>8.6–14.9</w:t>
             </w:r>
           </w:p>
         </w:tc>
@@ -2070,7 +2504,7 @@
       <w:tr>
         <w:tc>
           <w:tcPr>
-            <w:tcW w:type="dxa" w:w="2160"/>
+            <w:tcW w:type="dxa" w:w="1728"/>
           </w:tcPr>
           <w:p>
             <w:r>
@@ -2080,7 +2514,7 @@
         </w:tc>
         <w:tc>
           <w:tcPr>
-            <w:tcW w:type="dxa" w:w="2160"/>
+            <w:tcW w:type="dxa" w:w="1728"/>
           </w:tcPr>
           <w:p>
             <w:r>
@@ -2090,7 +2524,7 @@
         </w:tc>
         <w:tc>
           <w:tcPr>
-            <w:tcW w:type="dxa" w:w="2160"/>
+            <w:tcW w:type="dxa" w:w="1728"/>
           </w:tcPr>
           <w:p>
             <w:r>
@@ -2100,11 +2534,21 @@
         </w:tc>
         <w:tc>
           <w:tcPr>
-            <w:tcW w:type="dxa" w:w="2160"/>
+            <w:tcW w:type="dxa" w:w="1728"/>
           </w:tcPr>
           <w:p>
             <w:r>
               <w:t>18.0%</w:t>
+            </w:r>
+          </w:p>
+        </w:tc>
+        <w:tc>
+          <w:tcPr>
+            <w:tcW w:type="dxa" w:w="1728"/>
+          </w:tcPr>
+          <w:p>
+            <w:r>
+              <w:t>14.2–21.8</w:t>
             </w:r>
           </w:p>
         </w:tc>
@@ -2112,7 +2556,7 @@
       <w:tr>
         <w:tc>
           <w:tcPr>
-            <w:tcW w:type="dxa" w:w="2160"/>
+            <w:tcW w:type="dxa" w:w="1728"/>
           </w:tcPr>
           <w:p>
             <w:r>
@@ -2122,7 +2566,7 @@
         </w:tc>
         <w:tc>
           <w:tcPr>
-            <w:tcW w:type="dxa" w:w="2160"/>
+            <w:tcW w:type="dxa" w:w="1728"/>
           </w:tcPr>
           <w:p>
             <w:r>
@@ -2132,7 +2576,7 @@
         </w:tc>
         <w:tc>
           <w:tcPr>
-            <w:tcW w:type="dxa" w:w="2160"/>
+            <w:tcW w:type="dxa" w:w="1728"/>
           </w:tcPr>
           <w:p>
             <w:r>
@@ -2142,11 +2586,21 @@
         </w:tc>
         <w:tc>
           <w:tcPr>
-            <w:tcW w:type="dxa" w:w="2160"/>
+            <w:tcW w:type="dxa" w:w="1728"/>
           </w:tcPr>
           <w:p>
             <w:r>
               <w:t>30.8%</w:t>
+            </w:r>
+          </w:p>
+        </w:tc>
+        <w:tc>
+          <w:tcPr>
+            <w:tcW w:type="dxa" w:w="1728"/>
+          </w:tcPr>
+          <w:p>
+            <w:r>
+              <w:t>26.2–35.3</w:t>
             </w:r>
           </w:p>
         </w:tc>
@@ -2154,7 +2608,7 @@
       <w:tr>
         <w:tc>
           <w:tcPr>
-            <w:tcW w:type="dxa" w:w="2160"/>
+            <w:tcW w:type="dxa" w:w="1728"/>
           </w:tcPr>
           <w:p>
             <w:r>
@@ -2164,7 +2618,7 @@
         </w:tc>
         <w:tc>
           <w:tcPr>
-            <w:tcW w:type="dxa" w:w="2160"/>
+            <w:tcW w:type="dxa" w:w="1728"/>
           </w:tcPr>
           <w:p>
             <w:r>
@@ -2174,7 +2628,7 @@
         </w:tc>
         <w:tc>
           <w:tcPr>
-            <w:tcW w:type="dxa" w:w="2160"/>
+            <w:tcW w:type="dxa" w:w="1728"/>
           </w:tcPr>
           <w:p>
             <w:r>
@@ -2184,11 +2638,21 @@
         </w:tc>
         <w:tc>
           <w:tcPr>
-            <w:tcW w:type="dxa" w:w="2160"/>
+            <w:tcW w:type="dxa" w:w="1728"/>
           </w:tcPr>
           <w:p>
             <w:r>
               <w:t>49.5%</w:t>
+            </w:r>
+          </w:p>
+        </w:tc>
+        <w:tc>
+          <w:tcPr>
+            <w:tcW w:type="dxa" w:w="1728"/>
+          </w:tcPr>
+          <w:p>
+            <w:r>
+              <w:t>44.6–54.4</w:t>
             </w:r>
           </w:p>
         </w:tc>
@@ -2196,7 +2660,7 @@
       <w:tr>
         <w:tc>
           <w:tcPr>
-            <w:tcW w:type="dxa" w:w="2160"/>
+            <w:tcW w:type="dxa" w:w="1728"/>
           </w:tcPr>
           <w:p>
             <w:r>
@@ -2206,7 +2670,7 @@
         </w:tc>
         <w:tc>
           <w:tcPr>
-            <w:tcW w:type="dxa" w:w="2160"/>
+            <w:tcW w:type="dxa" w:w="1728"/>
           </w:tcPr>
           <w:p>
             <w:r>
@@ -2216,7 +2680,7 @@
         </w:tc>
         <w:tc>
           <w:tcPr>
-            <w:tcW w:type="dxa" w:w="2160"/>
+            <w:tcW w:type="dxa" w:w="1728"/>
           </w:tcPr>
           <w:p>
             <w:r>
@@ -2226,11 +2690,21 @@
         </w:tc>
         <w:tc>
           <w:tcPr>
-            <w:tcW w:type="dxa" w:w="2160"/>
+            <w:tcW w:type="dxa" w:w="1728"/>
           </w:tcPr>
           <w:p>
             <w:r>
               <w:t>68.8%</w:t>
+            </w:r>
+          </w:p>
+        </w:tc>
+        <w:tc>
+          <w:tcPr>
+            <w:tcW w:type="dxa" w:w="1728"/>
+          </w:tcPr>
+          <w:p>
+            <w:r>
+              <w:t>64.2–73.3</w:t>
             </w:r>
           </w:p>
         </w:tc>
@@ -2238,7 +2712,7 @@
       <w:tr>
         <w:tc>
           <w:tcPr>
-            <w:tcW w:type="dxa" w:w="2160"/>
+            <w:tcW w:type="dxa" w:w="1728"/>
           </w:tcPr>
           <w:p>
             <w:r>
@@ -2248,7 +2722,7 @@
         </w:tc>
         <w:tc>
           <w:tcPr>
-            <w:tcW w:type="dxa" w:w="2160"/>
+            <w:tcW w:type="dxa" w:w="1728"/>
           </w:tcPr>
           <w:p>
             <w:r>
@@ -2258,7 +2732,7 @@
         </w:tc>
         <w:tc>
           <w:tcPr>
-            <w:tcW w:type="dxa" w:w="2160"/>
+            <w:tcW w:type="dxa" w:w="1728"/>
           </w:tcPr>
           <w:p>
             <w:r>
@@ -2268,11 +2742,21 @@
         </w:tc>
         <w:tc>
           <w:tcPr>
-            <w:tcW w:type="dxa" w:w="2160"/>
+            <w:tcW w:type="dxa" w:w="1728"/>
           </w:tcPr>
           <w:p>
             <w:r>
               <w:t>42.2%</w:t>
+            </w:r>
+          </w:p>
+        </w:tc>
+        <w:tc>
+          <w:tcPr>
+            <w:tcW w:type="dxa" w:w="1728"/>
+          </w:tcPr>
+          <w:p>
+            <w:r>
+              <w:t>37.4–47.1</w:t>
             </w:r>
           </w:p>
         </w:tc>
@@ -2344,15 +2828,16 @@
         <w:tblLook w:firstColumn="1" w:firstRow="1" w:lastColumn="0" w:lastRow="0" w:noHBand="0" w:noVBand="1" w:val="04A0"/>
       </w:tblPr>
       <w:tblGrid>
-        <w:gridCol w:w="2160"/>
-        <w:gridCol w:w="2160"/>
-        <w:gridCol w:w="2160"/>
-        <w:gridCol w:w="2160"/>
+        <w:gridCol w:w="1728"/>
+        <w:gridCol w:w="1728"/>
+        <w:gridCol w:w="1728"/>
+        <w:gridCol w:w="1728"/>
+        <w:gridCol w:w="1728"/>
       </w:tblGrid>
       <w:tr>
         <w:tc>
           <w:tcPr>
-            <w:tcW w:type="dxa" w:w="2160"/>
+            <w:tcW w:type="dxa" w:w="1728"/>
           </w:tcPr>
           <w:p>
             <w:r>
@@ -2362,7 +2847,7 @@
         </w:tc>
         <w:tc>
           <w:tcPr>
-            <w:tcW w:type="dxa" w:w="2160"/>
+            <w:tcW w:type="dxa" w:w="1728"/>
           </w:tcPr>
           <w:p>
             <w:r>
@@ -2372,7 +2857,7 @@
         </w:tc>
         <w:tc>
           <w:tcPr>
-            <w:tcW w:type="dxa" w:w="2160"/>
+            <w:tcW w:type="dxa" w:w="1728"/>
           </w:tcPr>
           <w:p>
             <w:r>
@@ -2382,11 +2867,21 @@
         </w:tc>
         <w:tc>
           <w:tcPr>
-            <w:tcW w:type="dxa" w:w="2160"/>
+            <w:tcW w:type="dxa" w:w="1728"/>
           </w:tcPr>
           <w:p>
             <w:r>
               <w:t>%</w:t>
+            </w:r>
+          </w:p>
+        </w:tc>
+        <w:tc>
+          <w:tcPr>
+            <w:tcW w:type="dxa" w:w="1728"/>
+          </w:tcPr>
+          <w:p>
+            <w:r>
+              <w:t>95% CI</w:t>
             </w:r>
           </w:p>
         </w:tc>
@@ -2394,7 +2889,7 @@
       <w:tr>
         <w:tc>
           <w:tcPr>
-            <w:tcW w:type="dxa" w:w="2160"/>
+            <w:tcW w:type="dxa" w:w="1728"/>
           </w:tcPr>
           <w:p>
             <w:r>
@@ -2404,7 +2899,7 @@
         </w:tc>
         <w:tc>
           <w:tcPr>
-            <w:tcW w:type="dxa" w:w="2160"/>
+            <w:tcW w:type="dxa" w:w="1728"/>
           </w:tcPr>
           <w:p>
             <w:r>
@@ -2414,7 +2909,7 @@
         </w:tc>
         <w:tc>
           <w:tcPr>
-            <w:tcW w:type="dxa" w:w="2160"/>
+            <w:tcW w:type="dxa" w:w="1728"/>
           </w:tcPr>
           <w:p>
             <w:r>
@@ -2424,11 +2919,21 @@
         </w:tc>
         <w:tc>
           <w:tcPr>
-            <w:tcW w:type="dxa" w:w="2160"/>
+            <w:tcW w:type="dxa" w:w="1728"/>
           </w:tcPr>
           <w:p>
             <w:r>
               <w:t>21.5%</w:t>
+            </w:r>
+          </w:p>
+        </w:tc>
+        <w:tc>
+          <w:tcPr>
+            <w:tcW w:type="dxa" w:w="1728"/>
+          </w:tcPr>
+          <w:p>
+            <w:r>
+              <w:t>17.5–25.5</w:t>
             </w:r>
           </w:p>
         </w:tc>
@@ -2436,7 +2941,7 @@
       <w:tr>
         <w:tc>
           <w:tcPr>
-            <w:tcW w:type="dxa" w:w="2160"/>
+            <w:tcW w:type="dxa" w:w="1728"/>
           </w:tcPr>
           <w:p>
             <w:r>
@@ -2446,7 +2951,7 @@
         </w:tc>
         <w:tc>
           <w:tcPr>
-            <w:tcW w:type="dxa" w:w="2160"/>
+            <w:tcW w:type="dxa" w:w="1728"/>
           </w:tcPr>
           <w:p>
             <w:r>
@@ -2456,7 +2961,7 @@
         </w:tc>
         <w:tc>
           <w:tcPr>
-            <w:tcW w:type="dxa" w:w="2160"/>
+            <w:tcW w:type="dxa" w:w="1728"/>
           </w:tcPr>
           <w:p>
             <w:r>
@@ -2466,11 +2971,21 @@
         </w:tc>
         <w:tc>
           <w:tcPr>
-            <w:tcW w:type="dxa" w:w="2160"/>
+            <w:tcW w:type="dxa" w:w="1728"/>
           </w:tcPr>
           <w:p>
             <w:r>
               <w:t>78.5%</w:t>
+            </w:r>
+          </w:p>
+        </w:tc>
+        <w:tc>
+          <w:tcPr>
+            <w:tcW w:type="dxa" w:w="1728"/>
+          </w:tcPr>
+          <w:p>
+            <w:r>
+              <w:t>74.5–82.5</w:t>
             </w:r>
           </w:p>
         </w:tc>
@@ -2478,7 +2993,7 @@
       <w:tr>
         <w:tc>
           <w:tcPr>
-            <w:tcW w:type="dxa" w:w="2160"/>
+            <w:tcW w:type="dxa" w:w="1728"/>
           </w:tcPr>
           <w:p>
             <w:r>
@@ -2488,7 +3003,7 @@
         </w:tc>
         <w:tc>
           <w:tcPr>
-            <w:tcW w:type="dxa" w:w="2160"/>
+            <w:tcW w:type="dxa" w:w="1728"/>
           </w:tcPr>
           <w:p>
             <w:r>
@@ -2498,7 +3013,7 @@
         </w:tc>
         <w:tc>
           <w:tcPr>
-            <w:tcW w:type="dxa" w:w="2160"/>
+            <w:tcW w:type="dxa" w:w="1728"/>
           </w:tcPr>
           <w:p>
             <w:r>
@@ -2508,11 +3023,21 @@
         </w:tc>
         <w:tc>
           <w:tcPr>
-            <w:tcW w:type="dxa" w:w="2160"/>
+            <w:tcW w:type="dxa" w:w="1728"/>
           </w:tcPr>
           <w:p>
             <w:r>
               <w:t>36.5%</w:t>
+            </w:r>
+          </w:p>
+        </w:tc>
+        <w:tc>
+          <w:tcPr>
+            <w:tcW w:type="dxa" w:w="1728"/>
+          </w:tcPr>
+          <w:p>
+            <w:r>
+              <w:t>31.8–41.2</w:t>
             </w:r>
           </w:p>
         </w:tc>
@@ -2520,7 +3045,7 @@
       <w:tr>
         <w:tc>
           <w:tcPr>
-            <w:tcW w:type="dxa" w:w="2160"/>
+            <w:tcW w:type="dxa" w:w="1728"/>
           </w:tcPr>
           <w:p>
             <w:r>
@@ -2530,7 +3055,7 @@
         </w:tc>
         <w:tc>
           <w:tcPr>
-            <w:tcW w:type="dxa" w:w="2160"/>
+            <w:tcW w:type="dxa" w:w="1728"/>
           </w:tcPr>
           <w:p>
             <w:r>
@@ -2540,7 +3065,7 @@
         </w:tc>
         <w:tc>
           <w:tcPr>
-            <w:tcW w:type="dxa" w:w="2160"/>
+            <w:tcW w:type="dxa" w:w="1728"/>
           </w:tcPr>
           <w:p>
             <w:r>
@@ -2550,11 +3075,21 @@
         </w:tc>
         <w:tc>
           <w:tcPr>
-            <w:tcW w:type="dxa" w:w="2160"/>
+            <w:tcW w:type="dxa" w:w="1728"/>
           </w:tcPr>
           <w:p>
             <w:r>
               <w:t>63.5%</w:t>
+            </w:r>
+          </w:p>
+        </w:tc>
+        <w:tc>
+          <w:tcPr>
+            <w:tcW w:type="dxa" w:w="1728"/>
+          </w:tcPr>
+          <w:p>
+            <w:r>
+              <w:t>58.8–68.2</w:t>
             </w:r>
           </w:p>
         </w:tc>
@@ -2562,7 +3097,7 @@
       <w:tr>
         <w:tc>
           <w:tcPr>
-            <w:tcW w:type="dxa" w:w="2160"/>
+            <w:tcW w:type="dxa" w:w="1728"/>
           </w:tcPr>
           <w:p>
             <w:r>
@@ -2572,7 +3107,7 @@
         </w:tc>
         <w:tc>
           <w:tcPr>
-            <w:tcW w:type="dxa" w:w="2160"/>
+            <w:tcW w:type="dxa" w:w="1728"/>
           </w:tcPr>
           <w:p>
             <w:r>
@@ -2582,7 +3117,7 @@
         </w:tc>
         <w:tc>
           <w:tcPr>
-            <w:tcW w:type="dxa" w:w="2160"/>
+            <w:tcW w:type="dxa" w:w="1728"/>
           </w:tcPr>
           <w:p>
             <w:r>
@@ -2592,11 +3127,21 @@
         </w:tc>
         <w:tc>
           <w:tcPr>
-            <w:tcW w:type="dxa" w:w="2160"/>
+            <w:tcW w:type="dxa" w:w="1728"/>
           </w:tcPr>
           <w:p>
             <w:r>
               <w:t>24.0%</w:t>
+            </w:r>
+          </w:p>
+        </w:tc>
+        <w:tc>
+          <w:tcPr>
+            <w:tcW w:type="dxa" w:w="1728"/>
+          </w:tcPr>
+          <w:p>
+            <w:r>
+              <w:t>19.8–28.2</w:t>
             </w:r>
           </w:p>
         </w:tc>
@@ -2604,7 +3149,7 @@
       <w:tr>
         <w:tc>
           <w:tcPr>
-            <w:tcW w:type="dxa" w:w="2160"/>
+            <w:tcW w:type="dxa" w:w="1728"/>
           </w:tcPr>
           <w:p>
             <w:r>
@@ -2614,7 +3159,7 @@
         </w:tc>
         <w:tc>
           <w:tcPr>
-            <w:tcW w:type="dxa" w:w="2160"/>
+            <w:tcW w:type="dxa" w:w="1728"/>
           </w:tcPr>
           <w:p>
             <w:r>
@@ -2624,7 +3169,7 @@
         </w:tc>
         <w:tc>
           <w:tcPr>
-            <w:tcW w:type="dxa" w:w="2160"/>
+            <w:tcW w:type="dxa" w:w="1728"/>
           </w:tcPr>
           <w:p>
             <w:r>
@@ -2634,11 +3179,21 @@
         </w:tc>
         <w:tc>
           <w:tcPr>
-            <w:tcW w:type="dxa" w:w="2160"/>
+            <w:tcW w:type="dxa" w:w="1728"/>
           </w:tcPr>
           <w:p>
             <w:r>
               <w:t>0.0%</w:t>
+            </w:r>
+          </w:p>
+        </w:tc>
+        <w:tc>
+          <w:tcPr>
+            <w:tcW w:type="dxa" w:w="1728"/>
+          </w:tcPr>
+          <w:p>
+            <w:r>
+              <w:t>0.0–0.0</w:t>
             </w:r>
           </w:p>
         </w:tc>
@@ -2710,15 +3265,16 @@
         <w:tblLook w:firstColumn="1" w:firstRow="1" w:lastColumn="0" w:lastRow="0" w:noHBand="0" w:noVBand="1" w:val="04A0"/>
       </w:tblPr>
       <w:tblGrid>
-        <w:gridCol w:w="2160"/>
-        <w:gridCol w:w="2160"/>
-        <w:gridCol w:w="2160"/>
-        <w:gridCol w:w="2160"/>
+        <w:gridCol w:w="1728"/>
+        <w:gridCol w:w="1728"/>
+        <w:gridCol w:w="1728"/>
+        <w:gridCol w:w="1728"/>
+        <w:gridCol w:w="1728"/>
       </w:tblGrid>
       <w:tr>
         <w:tc>
           <w:tcPr>
-            <w:tcW w:type="dxa" w:w="2160"/>
+            <w:tcW w:type="dxa" w:w="1728"/>
           </w:tcPr>
           <w:p>
             <w:r>
@@ -2728,7 +3284,7 @@
         </w:tc>
         <w:tc>
           <w:tcPr>
-            <w:tcW w:type="dxa" w:w="2160"/>
+            <w:tcW w:type="dxa" w:w="1728"/>
           </w:tcPr>
           <w:p>
             <w:r>
@@ -2738,7 +3294,7 @@
         </w:tc>
         <w:tc>
           <w:tcPr>
-            <w:tcW w:type="dxa" w:w="2160"/>
+            <w:tcW w:type="dxa" w:w="1728"/>
           </w:tcPr>
           <w:p>
             <w:r>
@@ -2748,11 +3304,21 @@
         </w:tc>
         <w:tc>
           <w:tcPr>
-            <w:tcW w:type="dxa" w:w="2160"/>
+            <w:tcW w:type="dxa" w:w="1728"/>
           </w:tcPr>
           <w:p>
             <w:r>
               <w:t>%</w:t>
+            </w:r>
+          </w:p>
+        </w:tc>
+        <w:tc>
+          <w:tcPr>
+            <w:tcW w:type="dxa" w:w="1728"/>
+          </w:tcPr>
+          <w:p>
+            <w:r>
+              <w:t>95% CI</w:t>
             </w:r>
           </w:p>
         </w:tc>
@@ -2760,7 +3326,7 @@
       <w:tr>
         <w:tc>
           <w:tcPr>
-            <w:tcW w:type="dxa" w:w="2160"/>
+            <w:tcW w:type="dxa" w:w="1728"/>
           </w:tcPr>
           <w:p>
             <w:r>
@@ -2770,7 +3336,7 @@
         </w:tc>
         <w:tc>
           <w:tcPr>
-            <w:tcW w:type="dxa" w:w="2160"/>
+            <w:tcW w:type="dxa" w:w="1728"/>
           </w:tcPr>
           <w:p>
             <w:r>
@@ -2780,7 +3346,7 @@
         </w:tc>
         <w:tc>
           <w:tcPr>
-            <w:tcW w:type="dxa" w:w="2160"/>
+            <w:tcW w:type="dxa" w:w="1728"/>
           </w:tcPr>
           <w:p>
             <w:r>
@@ -2790,11 +3356,21 @@
         </w:tc>
         <w:tc>
           <w:tcPr>
-            <w:tcW w:type="dxa" w:w="2160"/>
+            <w:tcW w:type="dxa" w:w="1728"/>
           </w:tcPr>
           <w:p>
             <w:r>
               <w:t>73.8%</w:t>
+            </w:r>
+          </w:p>
+        </w:tc>
+        <w:tc>
+          <w:tcPr>
+            <w:tcW w:type="dxa" w:w="1728"/>
+          </w:tcPr>
+          <w:p>
+            <w:r>
+              <w:t>69.4–78.1</w:t>
             </w:r>
           </w:p>
         </w:tc>
@@ -2802,7 +3378,7 @@
       <w:tr>
         <w:tc>
           <w:tcPr>
-            <w:tcW w:type="dxa" w:w="2160"/>
+            <w:tcW w:type="dxa" w:w="1728"/>
           </w:tcPr>
           <w:p>
             <w:r>
@@ -2812,7 +3388,7 @@
         </w:tc>
         <w:tc>
           <w:tcPr>
-            <w:tcW w:type="dxa" w:w="2160"/>
+            <w:tcW w:type="dxa" w:w="1728"/>
           </w:tcPr>
           <w:p>
             <w:r>
@@ -2822,7 +3398,7 @@
         </w:tc>
         <w:tc>
           <w:tcPr>
-            <w:tcW w:type="dxa" w:w="2160"/>
+            <w:tcW w:type="dxa" w:w="1728"/>
           </w:tcPr>
           <w:p>
             <w:r>
@@ -2832,11 +3408,21 @@
         </w:tc>
         <w:tc>
           <w:tcPr>
-            <w:tcW w:type="dxa" w:w="2160"/>
+            <w:tcW w:type="dxa" w:w="1728"/>
           </w:tcPr>
           <w:p>
             <w:r>
               <w:t>24.2%</w:t>
+            </w:r>
+          </w:p>
+        </w:tc>
+        <w:tc>
+          <w:tcPr>
+            <w:tcW w:type="dxa" w:w="1728"/>
+          </w:tcPr>
+          <w:p>
+            <w:r>
+              <w:t>20.0–28.5</w:t>
             </w:r>
           </w:p>
         </w:tc>
@@ -2844,7 +3430,7 @@
       <w:tr>
         <w:tc>
           <w:tcPr>
-            <w:tcW w:type="dxa" w:w="2160"/>
+            <w:tcW w:type="dxa" w:w="1728"/>
           </w:tcPr>
           <w:p>
             <w:r>
@@ -2854,7 +3440,7 @@
         </w:tc>
         <w:tc>
           <w:tcPr>
-            <w:tcW w:type="dxa" w:w="2160"/>
+            <w:tcW w:type="dxa" w:w="1728"/>
           </w:tcPr>
           <w:p>
             <w:r>
@@ -2864,7 +3450,7 @@
         </w:tc>
         <w:tc>
           <w:tcPr>
-            <w:tcW w:type="dxa" w:w="2160"/>
+            <w:tcW w:type="dxa" w:w="1728"/>
           </w:tcPr>
           <w:p>
             <w:r>
@@ -2874,11 +3460,21 @@
         </w:tc>
         <w:tc>
           <w:tcPr>
-            <w:tcW w:type="dxa" w:w="2160"/>
+            <w:tcW w:type="dxa" w:w="1728"/>
           </w:tcPr>
           <w:p>
             <w:r>
               <w:t>65.2%</w:t>
+            </w:r>
+          </w:p>
+        </w:tc>
+        <w:tc>
+          <w:tcPr>
+            <w:tcW w:type="dxa" w:w="1728"/>
+          </w:tcPr>
+          <w:p>
+            <w:r>
+              <w:t>60.6–69.9</w:t>
             </w:r>
           </w:p>
         </w:tc>
@@ -2886,7 +3482,7 @@
       <w:tr>
         <w:tc>
           <w:tcPr>
-            <w:tcW w:type="dxa" w:w="2160"/>
+            <w:tcW w:type="dxa" w:w="1728"/>
           </w:tcPr>
           <w:p>
             <w:r>
@@ -2896,7 +3492,7 @@
         </w:tc>
         <w:tc>
           <w:tcPr>
-            <w:tcW w:type="dxa" w:w="2160"/>
+            <w:tcW w:type="dxa" w:w="1728"/>
           </w:tcPr>
           <w:p>
             <w:r>
@@ -2906,7 +3502,7 @@
         </w:tc>
         <w:tc>
           <w:tcPr>
-            <w:tcW w:type="dxa" w:w="2160"/>
+            <w:tcW w:type="dxa" w:w="1728"/>
           </w:tcPr>
           <w:p>
             <w:r>
@@ -2916,11 +3512,21 @@
         </w:tc>
         <w:tc>
           <w:tcPr>
-            <w:tcW w:type="dxa" w:w="2160"/>
+            <w:tcW w:type="dxa" w:w="1728"/>
           </w:tcPr>
           <w:p>
             <w:r>
               <w:t>65.0%</w:t>
+            </w:r>
+          </w:p>
+        </w:tc>
+        <w:tc>
+          <w:tcPr>
+            <w:tcW w:type="dxa" w:w="1728"/>
+          </w:tcPr>
+          <w:p>
+            <w:r>
+              <w:t>60.3–69.7</w:t>
             </w:r>
           </w:p>
         </w:tc>
@@ -2928,7 +3534,7 @@
       <w:tr>
         <w:tc>
           <w:tcPr>
-            <w:tcW w:type="dxa" w:w="2160"/>
+            <w:tcW w:type="dxa" w:w="1728"/>
           </w:tcPr>
           <w:p>
             <w:r>
@@ -2938,7 +3544,7 @@
         </w:tc>
         <w:tc>
           <w:tcPr>
-            <w:tcW w:type="dxa" w:w="2160"/>
+            <w:tcW w:type="dxa" w:w="1728"/>
           </w:tcPr>
           <w:p>
             <w:r>
@@ -2948,7 +3554,7 @@
         </w:tc>
         <w:tc>
           <w:tcPr>
-            <w:tcW w:type="dxa" w:w="2160"/>
+            <w:tcW w:type="dxa" w:w="1728"/>
           </w:tcPr>
           <w:p>
             <w:r>
@@ -2958,11 +3564,21 @@
         </w:tc>
         <w:tc>
           <w:tcPr>
-            <w:tcW w:type="dxa" w:w="2160"/>
+            <w:tcW w:type="dxa" w:w="1728"/>
           </w:tcPr>
           <w:p>
             <w:r>
               <w:t>47.8%</w:t>
+            </w:r>
+          </w:p>
+        </w:tc>
+        <w:tc>
+          <w:tcPr>
+            <w:tcW w:type="dxa" w:w="1728"/>
+          </w:tcPr>
+          <w:p>
+            <w:r>
+              <w:t>42.9–52.6</w:t>
             </w:r>
           </w:p>
         </w:tc>
@@ -2970,7 +3586,7 @@
       <w:tr>
         <w:tc>
           <w:tcPr>
-            <w:tcW w:type="dxa" w:w="2160"/>
+            <w:tcW w:type="dxa" w:w="1728"/>
           </w:tcPr>
           <w:p>
             <w:r>
@@ -2980,7 +3596,7 @@
         </w:tc>
         <w:tc>
           <w:tcPr>
-            <w:tcW w:type="dxa" w:w="2160"/>
+            <w:tcW w:type="dxa" w:w="1728"/>
           </w:tcPr>
           <w:p>
             <w:r>
@@ -2990,7 +3606,7 @@
         </w:tc>
         <w:tc>
           <w:tcPr>
-            <w:tcW w:type="dxa" w:w="2160"/>
+            <w:tcW w:type="dxa" w:w="1728"/>
           </w:tcPr>
           <w:p>
             <w:r>
@@ -3000,11 +3616,21 @@
         </w:tc>
         <w:tc>
           <w:tcPr>
-            <w:tcW w:type="dxa" w:w="2160"/>
+            <w:tcW w:type="dxa" w:w="1728"/>
           </w:tcPr>
           <w:p>
             <w:r>
               <w:t>52.2%</w:t>
+            </w:r>
+          </w:p>
+        </w:tc>
+        <w:tc>
+          <w:tcPr>
+            <w:tcW w:type="dxa" w:w="1728"/>
+          </w:tcPr>
+          <w:p>
+            <w:r>
+              <w:t>47.4–57.1</w:t>
             </w:r>
           </w:p>
         </w:tc>
@@ -3012,7 +3638,7 @@
       <w:tr>
         <w:tc>
           <w:tcPr>
-            <w:tcW w:type="dxa" w:w="2160"/>
+            <w:tcW w:type="dxa" w:w="1728"/>
           </w:tcPr>
           <w:p>
             <w:r>
@@ -3022,7 +3648,7 @@
         </w:tc>
         <w:tc>
           <w:tcPr>
-            <w:tcW w:type="dxa" w:w="2160"/>
+            <w:tcW w:type="dxa" w:w="1728"/>
           </w:tcPr>
           <w:p>
             <w:r>
@@ -3032,7 +3658,7 @@
         </w:tc>
         <w:tc>
           <w:tcPr>
-            <w:tcW w:type="dxa" w:w="2160"/>
+            <w:tcW w:type="dxa" w:w="1728"/>
           </w:tcPr>
           <w:p>
             <w:r>
@@ -3042,11 +3668,21 @@
         </w:tc>
         <w:tc>
           <w:tcPr>
-            <w:tcW w:type="dxa" w:w="2160"/>
+            <w:tcW w:type="dxa" w:w="1728"/>
           </w:tcPr>
           <w:p>
             <w:r>
               <w:t>70.2%</w:t>
+            </w:r>
+          </w:p>
+        </w:tc>
+        <w:tc>
+          <w:tcPr>
+            <w:tcW w:type="dxa" w:w="1728"/>
+          </w:tcPr>
+          <w:p>
+            <w:r>
+              <w:t>65.8–74.7</w:t>
             </w:r>
           </w:p>
         </w:tc>
@@ -3118,15 +3754,16 @@
         <w:tblLook w:firstColumn="1" w:firstRow="1" w:lastColumn="0" w:lastRow="0" w:noHBand="0" w:noVBand="1" w:val="04A0"/>
       </w:tblPr>
       <w:tblGrid>
-        <w:gridCol w:w="2160"/>
-        <w:gridCol w:w="2160"/>
-        <w:gridCol w:w="2160"/>
-        <w:gridCol w:w="2160"/>
+        <w:gridCol w:w="1728"/>
+        <w:gridCol w:w="1728"/>
+        <w:gridCol w:w="1728"/>
+        <w:gridCol w:w="1728"/>
+        <w:gridCol w:w="1728"/>
       </w:tblGrid>
       <w:tr>
         <w:tc>
           <w:tcPr>
-            <w:tcW w:type="dxa" w:w="2160"/>
+            <w:tcW w:type="dxa" w:w="1728"/>
           </w:tcPr>
           <w:p>
             <w:r>
@@ -3136,7 +3773,7 @@
         </w:tc>
         <w:tc>
           <w:tcPr>
-            <w:tcW w:type="dxa" w:w="2160"/>
+            <w:tcW w:type="dxa" w:w="1728"/>
           </w:tcPr>
           <w:p>
             <w:r>
@@ -3146,7 +3783,7 @@
         </w:tc>
         <w:tc>
           <w:tcPr>
-            <w:tcW w:type="dxa" w:w="2160"/>
+            <w:tcW w:type="dxa" w:w="1728"/>
           </w:tcPr>
           <w:p>
             <w:r>
@@ -3156,11 +3793,21 @@
         </w:tc>
         <w:tc>
           <w:tcPr>
-            <w:tcW w:type="dxa" w:w="2160"/>
+            <w:tcW w:type="dxa" w:w="1728"/>
           </w:tcPr>
           <w:p>
             <w:r>
               <w:t>%</w:t>
+            </w:r>
+          </w:p>
+        </w:tc>
+        <w:tc>
+          <w:tcPr>
+            <w:tcW w:type="dxa" w:w="1728"/>
+          </w:tcPr>
+          <w:p>
+            <w:r>
+              <w:t>95% CI</w:t>
             </w:r>
           </w:p>
         </w:tc>
@@ -3168,7 +3815,7 @@
       <w:tr>
         <w:tc>
           <w:tcPr>
-            <w:tcW w:type="dxa" w:w="2160"/>
+            <w:tcW w:type="dxa" w:w="1728"/>
           </w:tcPr>
           <w:p>
             <w:r>
@@ -3178,7 +3825,7 @@
         </w:tc>
         <w:tc>
           <w:tcPr>
-            <w:tcW w:type="dxa" w:w="2160"/>
+            <w:tcW w:type="dxa" w:w="1728"/>
           </w:tcPr>
           <w:p>
             <w:r>
@@ -3188,7 +3835,7 @@
         </w:tc>
         <w:tc>
           <w:tcPr>
-            <w:tcW w:type="dxa" w:w="2160"/>
+            <w:tcW w:type="dxa" w:w="1728"/>
           </w:tcPr>
           <w:p>
             <w:r>
@@ -3198,11 +3845,21 @@
         </w:tc>
         <w:tc>
           <w:tcPr>
-            <w:tcW w:type="dxa" w:w="2160"/>
+            <w:tcW w:type="dxa" w:w="1728"/>
           </w:tcPr>
           <w:p>
             <w:r>
               <w:t>49.0%</w:t>
+            </w:r>
+          </w:p>
+        </w:tc>
+        <w:tc>
+          <w:tcPr>
+            <w:tcW w:type="dxa" w:w="1728"/>
+          </w:tcPr>
+          <w:p>
+            <w:r>
+              <w:t>44.1–53.9</w:t>
             </w:r>
           </w:p>
         </w:tc>
@@ -3210,7 +3867,7 @@
       <w:tr>
         <w:tc>
           <w:tcPr>
-            <w:tcW w:type="dxa" w:w="2160"/>
+            <w:tcW w:type="dxa" w:w="1728"/>
           </w:tcPr>
           <w:p>
             <w:r>
@@ -3220,7 +3877,7 @@
         </w:tc>
         <w:tc>
           <w:tcPr>
-            <w:tcW w:type="dxa" w:w="2160"/>
+            <w:tcW w:type="dxa" w:w="1728"/>
           </w:tcPr>
           <w:p>
             <w:r>
@@ -3230,7 +3887,7 @@
         </w:tc>
         <w:tc>
           <w:tcPr>
-            <w:tcW w:type="dxa" w:w="2160"/>
+            <w:tcW w:type="dxa" w:w="1728"/>
           </w:tcPr>
           <w:p>
             <w:r>
@@ -3240,11 +3897,21 @@
         </w:tc>
         <w:tc>
           <w:tcPr>
-            <w:tcW w:type="dxa" w:w="2160"/>
+            <w:tcW w:type="dxa" w:w="1728"/>
           </w:tcPr>
           <w:p>
             <w:r>
               <w:t>17.0%</w:t>
+            </w:r>
+          </w:p>
+        </w:tc>
+        <w:tc>
+          <w:tcPr>
+            <w:tcW w:type="dxa" w:w="1728"/>
+          </w:tcPr>
+          <w:p>
+            <w:r>
+              <w:t>13.3–20.7</w:t>
             </w:r>
           </w:p>
         </w:tc>
@@ -3252,7 +3919,7 @@
       <w:tr>
         <w:tc>
           <w:tcPr>
-            <w:tcW w:type="dxa" w:w="2160"/>
+            <w:tcW w:type="dxa" w:w="1728"/>
           </w:tcPr>
           <w:p>
             <w:r>
@@ -3262,7 +3929,7 @@
         </w:tc>
         <w:tc>
           <w:tcPr>
-            <w:tcW w:type="dxa" w:w="2160"/>
+            <w:tcW w:type="dxa" w:w="1728"/>
           </w:tcPr>
           <w:p>
             <w:r>
@@ -3272,7 +3939,7 @@
         </w:tc>
         <w:tc>
           <w:tcPr>
-            <w:tcW w:type="dxa" w:w="2160"/>
+            <w:tcW w:type="dxa" w:w="1728"/>
           </w:tcPr>
           <w:p>
             <w:r>
@@ -3282,11 +3949,21 @@
         </w:tc>
         <w:tc>
           <w:tcPr>
-            <w:tcW w:type="dxa" w:w="2160"/>
+            <w:tcW w:type="dxa" w:w="1728"/>
           </w:tcPr>
           <w:p>
             <w:r>
               <w:t>0.0%</w:t>
+            </w:r>
+          </w:p>
+        </w:tc>
+        <w:tc>
+          <w:tcPr>
+            <w:tcW w:type="dxa" w:w="1728"/>
+          </w:tcPr>
+          <w:p>
+            <w:r>
+              <w:t>0.0–0.0</w:t>
             </w:r>
           </w:p>
         </w:tc>
@@ -3294,7 +3971,7 @@
       <w:tr>
         <w:tc>
           <w:tcPr>
-            <w:tcW w:type="dxa" w:w="2160"/>
+            <w:tcW w:type="dxa" w:w="1728"/>
           </w:tcPr>
           <w:p>
             <w:r>
@@ -3304,7 +3981,7 @@
         </w:tc>
         <w:tc>
           <w:tcPr>
-            <w:tcW w:type="dxa" w:w="2160"/>
+            <w:tcW w:type="dxa" w:w="1728"/>
           </w:tcPr>
           <w:p>
             <w:r>
@@ -3314,7 +3991,7 @@
         </w:tc>
         <w:tc>
           <w:tcPr>
-            <w:tcW w:type="dxa" w:w="2160"/>
+            <w:tcW w:type="dxa" w:w="1728"/>
           </w:tcPr>
           <w:p>
             <w:r>
@@ -3324,11 +4001,21 @@
         </w:tc>
         <w:tc>
           <w:tcPr>
-            <w:tcW w:type="dxa" w:w="2160"/>
+            <w:tcW w:type="dxa" w:w="1728"/>
           </w:tcPr>
           <w:p>
             <w:r>
               <w:t>69.0%</w:t>
+            </w:r>
+          </w:p>
+        </w:tc>
+        <w:tc>
+          <w:tcPr>
+            <w:tcW w:type="dxa" w:w="1728"/>
+          </w:tcPr>
+          <w:p>
+            <w:r>
+              <w:t>64.5–73.5</w:t>
             </w:r>
           </w:p>
         </w:tc>
@@ -3336,7 +4023,7 @@
       <w:tr>
         <w:tc>
           <w:tcPr>
-            <w:tcW w:type="dxa" w:w="2160"/>
+            <w:tcW w:type="dxa" w:w="1728"/>
           </w:tcPr>
           <w:p>
             <w:r>
@@ -3346,7 +4033,7 @@
         </w:tc>
         <w:tc>
           <w:tcPr>
-            <w:tcW w:type="dxa" w:w="2160"/>
+            <w:tcW w:type="dxa" w:w="1728"/>
           </w:tcPr>
           <w:p>
             <w:r>
@@ -3356,7 +4043,7 @@
         </w:tc>
         <w:tc>
           <w:tcPr>
-            <w:tcW w:type="dxa" w:w="2160"/>
+            <w:tcW w:type="dxa" w:w="1728"/>
           </w:tcPr>
           <w:p>
             <w:r>
@@ -3366,11 +4053,21 @@
         </w:tc>
         <w:tc>
           <w:tcPr>
-            <w:tcW w:type="dxa" w:w="2160"/>
+            <w:tcW w:type="dxa" w:w="1728"/>
           </w:tcPr>
           <w:p>
             <w:r>
               <w:t>71.8%</w:t>
+            </w:r>
+          </w:p>
+        </w:tc>
+        <w:tc>
+          <w:tcPr>
+            <w:tcW w:type="dxa" w:w="1728"/>
+          </w:tcPr>
+          <w:p>
+            <w:r>
+              <w:t>67.3–76.2</w:t>
             </w:r>
           </w:p>
         </w:tc>
@@ -3378,7 +4075,7 @@
       <w:tr>
         <w:tc>
           <w:tcPr>
-            <w:tcW w:type="dxa" w:w="2160"/>
+            <w:tcW w:type="dxa" w:w="1728"/>
           </w:tcPr>
           <w:p>
             <w:r>
@@ -3388,7 +4085,7 @@
         </w:tc>
         <w:tc>
           <w:tcPr>
-            <w:tcW w:type="dxa" w:w="2160"/>
+            <w:tcW w:type="dxa" w:w="1728"/>
           </w:tcPr>
           <w:p>
             <w:r>
@@ -3398,7 +4095,7 @@
         </w:tc>
         <w:tc>
           <w:tcPr>
-            <w:tcW w:type="dxa" w:w="2160"/>
+            <w:tcW w:type="dxa" w:w="1728"/>
           </w:tcPr>
           <w:p>
             <w:r>
@@ -3408,11 +4105,21 @@
         </w:tc>
         <w:tc>
           <w:tcPr>
-            <w:tcW w:type="dxa" w:w="2160"/>
+            <w:tcW w:type="dxa" w:w="1728"/>
           </w:tcPr>
           <w:p>
             <w:r>
               <w:t>43.8%</w:t>
+            </w:r>
+          </w:p>
+        </w:tc>
+        <w:tc>
+          <w:tcPr>
+            <w:tcW w:type="dxa" w:w="1728"/>
+          </w:tcPr>
+          <w:p>
+            <w:r>
+              <w:t>38.9–48.6</w:t>
             </w:r>
           </w:p>
         </w:tc>
@@ -3420,7 +4127,7 @@
       <w:tr>
         <w:tc>
           <w:tcPr>
-            <w:tcW w:type="dxa" w:w="2160"/>
+            <w:tcW w:type="dxa" w:w="1728"/>
           </w:tcPr>
           <w:p>
             <w:r>
@@ -3430,7 +4137,7 @@
         </w:tc>
         <w:tc>
           <w:tcPr>
-            <w:tcW w:type="dxa" w:w="2160"/>
+            <w:tcW w:type="dxa" w:w="1728"/>
           </w:tcPr>
           <w:p>
             <w:r>
@@ -3440,7 +4147,7 @@
         </w:tc>
         <w:tc>
           <w:tcPr>
-            <w:tcW w:type="dxa" w:w="2160"/>
+            <w:tcW w:type="dxa" w:w="1728"/>
           </w:tcPr>
           <w:p>
             <w:r>
@@ -3450,11 +4157,21 @@
         </w:tc>
         <w:tc>
           <w:tcPr>
-            <w:tcW w:type="dxa" w:w="2160"/>
+            <w:tcW w:type="dxa" w:w="1728"/>
           </w:tcPr>
           <w:p>
             <w:r>
               <w:t>49.8%</w:t>
+            </w:r>
+          </w:p>
+        </w:tc>
+        <w:tc>
+          <w:tcPr>
+            <w:tcW w:type="dxa" w:w="1728"/>
+          </w:tcPr>
+          <w:p>
+            <w:r>
+              <w:t>44.9–54.6</w:t>
             </w:r>
           </w:p>
         </w:tc>
@@ -3462,7 +4179,7 @@
       <w:tr>
         <w:tc>
           <w:tcPr>
-            <w:tcW w:type="dxa" w:w="2160"/>
+            <w:tcW w:type="dxa" w:w="1728"/>
           </w:tcPr>
           <w:p>
             <w:r>
@@ -3472,7 +4189,7 @@
         </w:tc>
         <w:tc>
           <w:tcPr>
-            <w:tcW w:type="dxa" w:w="2160"/>
+            <w:tcW w:type="dxa" w:w="1728"/>
           </w:tcPr>
           <w:p>
             <w:r>
@@ -3482,7 +4199,7 @@
         </w:tc>
         <w:tc>
           <w:tcPr>
-            <w:tcW w:type="dxa" w:w="2160"/>
+            <w:tcW w:type="dxa" w:w="1728"/>
           </w:tcPr>
           <w:p>
             <w:r>
@@ -3492,11 +4209,21 @@
         </w:tc>
         <w:tc>
           <w:tcPr>
-            <w:tcW w:type="dxa" w:w="2160"/>
+            <w:tcW w:type="dxa" w:w="1728"/>
           </w:tcPr>
           <w:p>
             <w:r>
               <w:t>69.2%</w:t>
+            </w:r>
+          </w:p>
+        </w:tc>
+        <w:tc>
+          <w:tcPr>
+            <w:tcW w:type="dxa" w:w="1728"/>
+          </w:tcPr>
+          <w:p>
+            <w:r>
+              <w:t>64.7–73.8</w:t>
             </w:r>
           </w:p>
         </w:tc>
@@ -3504,7 +4231,7 @@
       <w:tr>
         <w:tc>
           <w:tcPr>
-            <w:tcW w:type="dxa" w:w="2160"/>
+            <w:tcW w:type="dxa" w:w="1728"/>
           </w:tcPr>
           <w:p>
             <w:r>
@@ -3514,7 +4241,7 @@
         </w:tc>
         <w:tc>
           <w:tcPr>
-            <w:tcW w:type="dxa" w:w="2160"/>
+            <w:tcW w:type="dxa" w:w="1728"/>
           </w:tcPr>
           <w:p>
             <w:r>
@@ -3524,7 +4251,7 @@
         </w:tc>
         <w:tc>
           <w:tcPr>
-            <w:tcW w:type="dxa" w:w="2160"/>
+            <w:tcW w:type="dxa" w:w="1728"/>
           </w:tcPr>
           <w:p>
             <w:r>
@@ -3534,11 +4261,21 @@
         </w:tc>
         <w:tc>
           <w:tcPr>
-            <w:tcW w:type="dxa" w:w="2160"/>
+            <w:tcW w:type="dxa" w:w="1728"/>
           </w:tcPr>
           <w:p>
             <w:r>
               <w:t>47.0%</w:t>
+            </w:r>
+          </w:p>
+        </w:tc>
+        <w:tc>
+          <w:tcPr>
+            <w:tcW w:type="dxa" w:w="1728"/>
+          </w:tcPr>
+          <w:p>
+            <w:r>
+              <w:t>42.1–51.9</w:t>
             </w:r>
           </w:p>
         </w:tc>
@@ -3546,7 +4283,7 @@
       <w:tr>
         <w:tc>
           <w:tcPr>
-            <w:tcW w:type="dxa" w:w="2160"/>
+            <w:tcW w:type="dxa" w:w="1728"/>
           </w:tcPr>
           <w:p>
             <w:r>
@@ -3556,7 +4293,7 @@
         </w:tc>
         <w:tc>
           <w:tcPr>
-            <w:tcW w:type="dxa" w:w="2160"/>
+            <w:tcW w:type="dxa" w:w="1728"/>
           </w:tcPr>
           <w:p>
             <w:r>
@@ -3566,7 +4303,7 @@
         </w:tc>
         <w:tc>
           <w:tcPr>
-            <w:tcW w:type="dxa" w:w="2160"/>
+            <w:tcW w:type="dxa" w:w="1728"/>
           </w:tcPr>
           <w:p>
             <w:r>
@@ -3576,11 +4313,21 @@
         </w:tc>
         <w:tc>
           <w:tcPr>
-            <w:tcW w:type="dxa" w:w="2160"/>
+            <w:tcW w:type="dxa" w:w="1728"/>
           </w:tcPr>
           <w:p>
             <w:r>
               <w:t>53.0%</w:t>
+            </w:r>
+          </w:p>
+        </w:tc>
+        <w:tc>
+          <w:tcPr>
+            <w:tcW w:type="dxa" w:w="1728"/>
+          </w:tcPr>
+          <w:p>
+            <w:r>
+              <w:t>48.1–57.9</w:t>
             </w:r>
           </w:p>
         </w:tc>
@@ -3652,15 +4399,16 @@
         <w:tblLook w:firstColumn="1" w:firstRow="1" w:lastColumn="0" w:lastRow="0" w:noHBand="0" w:noVBand="1" w:val="04A0"/>
       </w:tblPr>
       <w:tblGrid>
-        <w:gridCol w:w="2160"/>
-        <w:gridCol w:w="2160"/>
-        <w:gridCol w:w="2160"/>
-        <w:gridCol w:w="2160"/>
+        <w:gridCol w:w="1728"/>
+        <w:gridCol w:w="1728"/>
+        <w:gridCol w:w="1728"/>
+        <w:gridCol w:w="1728"/>
+        <w:gridCol w:w="1728"/>
       </w:tblGrid>
       <w:tr>
         <w:tc>
           <w:tcPr>
-            <w:tcW w:type="dxa" w:w="2160"/>
+            <w:tcW w:type="dxa" w:w="1728"/>
           </w:tcPr>
           <w:p>
             <w:r>
@@ -3670,7 +4418,7 @@
         </w:tc>
         <w:tc>
           <w:tcPr>
-            <w:tcW w:type="dxa" w:w="2160"/>
+            <w:tcW w:type="dxa" w:w="1728"/>
           </w:tcPr>
           <w:p>
             <w:r>
@@ -3680,7 +4428,7 @@
         </w:tc>
         <w:tc>
           <w:tcPr>
-            <w:tcW w:type="dxa" w:w="2160"/>
+            <w:tcW w:type="dxa" w:w="1728"/>
           </w:tcPr>
           <w:p>
             <w:r>
@@ -3690,11 +4438,21 @@
         </w:tc>
         <w:tc>
           <w:tcPr>
-            <w:tcW w:type="dxa" w:w="2160"/>
+            <w:tcW w:type="dxa" w:w="1728"/>
           </w:tcPr>
           <w:p>
             <w:r>
               <w:t>%</w:t>
+            </w:r>
+          </w:p>
+        </w:tc>
+        <w:tc>
+          <w:tcPr>
+            <w:tcW w:type="dxa" w:w="1728"/>
+          </w:tcPr>
+          <w:p>
+            <w:r>
+              <w:t>95% CI</w:t>
             </w:r>
           </w:p>
         </w:tc>
@@ -3702,7 +4460,7 @@
       <w:tr>
         <w:tc>
           <w:tcPr>
-            <w:tcW w:type="dxa" w:w="2160"/>
+            <w:tcW w:type="dxa" w:w="1728"/>
           </w:tcPr>
           <w:p>
             <w:r>
@@ -3712,7 +4470,7 @@
         </w:tc>
         <w:tc>
           <w:tcPr>
-            <w:tcW w:type="dxa" w:w="2160"/>
+            <w:tcW w:type="dxa" w:w="1728"/>
           </w:tcPr>
           <w:p>
             <w:r>
@@ -3722,7 +4480,7 @@
         </w:tc>
         <w:tc>
           <w:tcPr>
-            <w:tcW w:type="dxa" w:w="2160"/>
+            <w:tcW w:type="dxa" w:w="1728"/>
           </w:tcPr>
           <w:p>
             <w:r>
@@ -3732,11 +4490,21 @@
         </w:tc>
         <w:tc>
           <w:tcPr>
-            <w:tcW w:type="dxa" w:w="2160"/>
+            <w:tcW w:type="dxa" w:w="1728"/>
           </w:tcPr>
           <w:p>
             <w:r>
               <w:t>0.0%</w:t>
+            </w:r>
+          </w:p>
+        </w:tc>
+        <w:tc>
+          <w:tcPr>
+            <w:tcW w:type="dxa" w:w="1728"/>
+          </w:tcPr>
+          <w:p>
+            <w:r>
+              <w:t>0.0–0.0</w:t>
             </w:r>
           </w:p>
         </w:tc>
@@ -3744,7 +4512,7 @@
       <w:tr>
         <w:tc>
           <w:tcPr>
-            <w:tcW w:type="dxa" w:w="2160"/>
+            <w:tcW w:type="dxa" w:w="1728"/>
           </w:tcPr>
           <w:p>
             <w:r>
@@ -3754,7 +4522,7 @@
         </w:tc>
         <w:tc>
           <w:tcPr>
-            <w:tcW w:type="dxa" w:w="2160"/>
+            <w:tcW w:type="dxa" w:w="1728"/>
           </w:tcPr>
           <w:p>
             <w:r>
@@ -3764,7 +4532,7 @@
         </w:tc>
         <w:tc>
           <w:tcPr>
-            <w:tcW w:type="dxa" w:w="2160"/>
+            <w:tcW w:type="dxa" w:w="1728"/>
           </w:tcPr>
           <w:p>
             <w:r>
@@ -3774,11 +4542,21 @@
         </w:tc>
         <w:tc>
           <w:tcPr>
-            <w:tcW w:type="dxa" w:w="2160"/>
+            <w:tcW w:type="dxa" w:w="1728"/>
           </w:tcPr>
           <w:p>
             <w:r>
               <w:t>34.2%</w:t>
+            </w:r>
+          </w:p>
+        </w:tc>
+        <w:tc>
+          <w:tcPr>
+            <w:tcW w:type="dxa" w:w="1728"/>
+          </w:tcPr>
+          <w:p>
+            <w:r>
+              <w:t>29.6–38.9</w:t>
             </w:r>
           </w:p>
         </w:tc>
@@ -3786,7 +4564,7 @@
       <w:tr>
         <w:tc>
           <w:tcPr>
-            <w:tcW w:type="dxa" w:w="2160"/>
+            <w:tcW w:type="dxa" w:w="1728"/>
           </w:tcPr>
           <w:p>
             <w:r>
@@ -3796,7 +4574,7 @@
         </w:tc>
         <w:tc>
           <w:tcPr>
-            <w:tcW w:type="dxa" w:w="2160"/>
+            <w:tcW w:type="dxa" w:w="1728"/>
           </w:tcPr>
           <w:p>
             <w:r>
@@ -3806,7 +4584,7 @@
         </w:tc>
         <w:tc>
           <w:tcPr>
-            <w:tcW w:type="dxa" w:w="2160"/>
+            <w:tcW w:type="dxa" w:w="1728"/>
           </w:tcPr>
           <w:p>
             <w:r>
@@ -3816,11 +4594,21 @@
         </w:tc>
         <w:tc>
           <w:tcPr>
-            <w:tcW w:type="dxa" w:w="2160"/>
+            <w:tcW w:type="dxa" w:w="1728"/>
           </w:tcPr>
           <w:p>
             <w:r>
               <w:t>42.5%</w:t>
+            </w:r>
+          </w:p>
+        </w:tc>
+        <w:tc>
+          <w:tcPr>
+            <w:tcW w:type="dxa" w:w="1728"/>
+          </w:tcPr>
+          <w:p>
+            <w:r>
+              <w:t>37.7–47.3</w:t>
             </w:r>
           </w:p>
         </w:tc>
@@ -3828,7 +4616,7 @@
       <w:tr>
         <w:tc>
           <w:tcPr>
-            <w:tcW w:type="dxa" w:w="2160"/>
+            <w:tcW w:type="dxa" w:w="1728"/>
           </w:tcPr>
           <w:p>
             <w:r>
@@ -3838,7 +4626,7 @@
         </w:tc>
         <w:tc>
           <w:tcPr>
-            <w:tcW w:type="dxa" w:w="2160"/>
+            <w:tcW w:type="dxa" w:w="1728"/>
           </w:tcPr>
           <w:p>
             <w:r>
@@ -3848,7 +4636,7 @@
         </w:tc>
         <w:tc>
           <w:tcPr>
-            <w:tcW w:type="dxa" w:w="2160"/>
+            <w:tcW w:type="dxa" w:w="1728"/>
           </w:tcPr>
           <w:p>
             <w:r>
@@ -3858,11 +4646,21 @@
         </w:tc>
         <w:tc>
           <w:tcPr>
-            <w:tcW w:type="dxa" w:w="2160"/>
+            <w:tcW w:type="dxa" w:w="1728"/>
           </w:tcPr>
           <w:p>
             <w:r>
               <w:t>13.0%</w:t>
+            </w:r>
+          </w:p>
+        </w:tc>
+        <w:tc>
+          <w:tcPr>
+            <w:tcW w:type="dxa" w:w="1728"/>
+          </w:tcPr>
+          <w:p>
+            <w:r>
+              <w:t>9.7–16.3</w:t>
             </w:r>
           </w:p>
         </w:tc>
@@ -3870,7 +4668,7 @@
       <w:tr>
         <w:tc>
           <w:tcPr>
-            <w:tcW w:type="dxa" w:w="2160"/>
+            <w:tcW w:type="dxa" w:w="1728"/>
           </w:tcPr>
           <w:p>
             <w:r>
@@ -3880,7 +4678,7 @@
         </w:tc>
         <w:tc>
           <w:tcPr>
-            <w:tcW w:type="dxa" w:w="2160"/>
+            <w:tcW w:type="dxa" w:w="1728"/>
           </w:tcPr>
           <w:p>
             <w:r>
@@ -3890,7 +4688,7 @@
         </w:tc>
         <w:tc>
           <w:tcPr>
-            <w:tcW w:type="dxa" w:w="2160"/>
+            <w:tcW w:type="dxa" w:w="1728"/>
           </w:tcPr>
           <w:p>
             <w:r>
@@ -3900,11 +4698,21 @@
         </w:tc>
         <w:tc>
           <w:tcPr>
-            <w:tcW w:type="dxa" w:w="2160"/>
+            <w:tcW w:type="dxa" w:w="1728"/>
           </w:tcPr>
           <w:p>
             <w:r>
               <w:t>63.7%</w:t>
+            </w:r>
+          </w:p>
+        </w:tc>
+        <w:tc>
+          <w:tcPr>
+            <w:tcW w:type="dxa" w:w="1728"/>
+          </w:tcPr>
+          <w:p>
+            <w:r>
+              <w:t>59.0–68.5</w:t>
             </w:r>
           </w:p>
         </w:tc>

</xml_diff>